<commit_message>
Rivian Automotive, Embedded Software/Firmware Summer 2025 Internships
</commit_message>
<xml_diff>
--- a/Marika_Nishi_Resume.docx
+++ b/Marika_Nishi_Resume.docx
@@ -11,6 +11,8 @@
         <w:jc w:val="center"/>
         <w:rPr>
           <w:rFonts w:ascii="Garamond" w:hAnsi="Garamond" w:cs="Arial"/>
+          <w:sz w:val="32"/>
+          <w:szCs w:val="18"/>
         </w:rPr>
       </w:pPr>
       <w:r>
@@ -22,34 +24,17 @@
       </w:r>
       <w:r>
         <w:rPr>
-          <w:rFonts w:ascii="Garamond" w:hAnsi="Garamond" w:cs="Arial"/>
+          <w:rFonts w:ascii="Times New Roman" w:hAnsi="Times New Roman" w:cs="Times New Roman"/>
           <w:sz w:val="40"/>
         </w:rPr>
         <w:t xml:space="preserve"> </w:t>
       </w:r>
       <w:r>
         <w:rPr>
-          <w:rFonts w:ascii="Garamond" w:hAnsi="Garamond" w:cs="Arial"/>
-          <w:sz w:val="20"/>
-          <w:szCs w:val="20"/>
-        </w:rPr>
-        <w:t>Software Engineer, R</w:t>
-      </w:r>
-      <w:r>
-        <w:rPr>
-          <w:rFonts w:ascii="Garamond" w:hAnsi="Garamond" w:cs="Arial"/>
-          <w:sz w:val="20"/>
-          <w:szCs w:val="20"/>
-        </w:rPr>
-        <w:t>obot Software Infrastructure</w:t>
-      </w:r>
-      <w:r>
-        <w:rPr>
-          <w:rFonts w:ascii="Garamond" w:hAnsi="Garamond" w:cs="Arial"/>
-          <w:sz w:val="20"/>
-          <w:szCs w:val="20"/>
-        </w:rPr>
-        <w:t xml:space="preserve"> Intern</w:t>
+          <w:rFonts w:ascii="Times New Roman" w:hAnsi="Times New Roman" w:cs="Times New Roman"/>
+          <w:szCs w:val="12"/>
+        </w:rPr>
+        <w:t>Embedded Software/Firmware Summer 2025 Internships</w:t>
       </w:r>
     </w:p>
     <w:p>
@@ -655,6 +640,105 @@
           <w:sz w:val="21"/>
           <w:szCs w:val="21"/>
         </w:rPr>
+        <w:t xml:space="preserve">ROS, ROS2, Python, Pytorch, </w:t>
+      </w:r>
+      <w:r>
+        <w:rPr>
+          <w:rFonts w:ascii="Garamond" w:hAnsi="Garamond" w:cs="Arial"/>
+          <w:iCs/>
+          <w:sz w:val="21"/>
+          <w:szCs w:val="21"/>
+        </w:rPr>
+        <w:t xml:space="preserve">C++, </w:t>
+      </w:r>
+      <w:r>
+        <w:rPr>
+          <w:rFonts w:ascii="Garamond" w:hAnsi="Garamond" w:cs="Arial"/>
+          <w:sz w:val="21"/>
+          <w:szCs w:val="21"/>
+        </w:rPr>
+        <w:t xml:space="preserve">Software development, Embedded software, Vehicle software, </w:t>
+      </w:r>
+      <w:r>
+        <w:rPr>
+          <w:rFonts w:ascii="Garamond" w:hAnsi="Garamond" w:cs="Arial"/>
+          <w:iCs/>
+          <w:sz w:val="21"/>
+          <w:szCs w:val="21"/>
+        </w:rPr>
+        <w:t xml:space="preserve">Matlab, Arduino IDE, </w:t>
+      </w:r>
+      <w:r>
+        <w:rPr>
+          <w:rFonts w:ascii="Garamond" w:hAnsi="Garamond" w:cs="Arial"/>
+          <w:sz w:val="21"/>
+          <w:szCs w:val="21"/>
+        </w:rPr>
+        <w:t>Simulator</w:t>
+      </w:r>
+      <w:r>
+        <w:rPr>
+          <w:rFonts w:ascii="Garamond" w:hAnsi="Garamond" w:cs="Arial"/>
+          <w:sz w:val="21"/>
+          <w:szCs w:val="21"/>
+        </w:rPr>
+        <w:t xml:space="preserve">, </w:t>
+      </w:r>
+      <w:r>
+        <w:rPr>
+          <w:rFonts w:ascii="Garamond" w:hAnsi="Garamond" w:cs="Arial"/>
+          <w:sz w:val="21"/>
+          <w:szCs w:val="21"/>
+        </w:rPr>
+        <w:t xml:space="preserve">OpenCV, </w:t>
+      </w:r>
+      <w:r>
+        <w:rPr>
+          <w:rFonts w:ascii="Garamond" w:hAnsi="Garamond" w:cs="Arial"/>
+          <w:sz w:val="21"/>
+          <w:szCs w:val="21"/>
+        </w:rPr>
+        <w:t>CAD</w:t>
+      </w:r>
+      <w:r>
+        <w:rPr>
+          <w:rFonts w:ascii="Garamond" w:hAnsi="Garamond" w:cs="Arial"/>
+          <w:sz w:val="21"/>
+          <w:szCs w:val="21"/>
+        </w:rPr>
+        <w:t xml:space="preserve"> (Autoware, SolidWorks)</w:t>
+      </w:r>
+      <w:r>
+        <w:rPr>
+          <w:rFonts w:ascii="Garamond" w:hAnsi="Garamond" w:cs="Arial"/>
+          <w:sz w:val="21"/>
+          <w:szCs w:val="21"/>
+        </w:rPr>
+        <w:t xml:space="preserve">, </w:t>
+      </w:r>
+      <w:r>
+        <w:rPr>
+          <w:rFonts w:ascii="Garamond" w:hAnsi="Garamond" w:cs="Arial"/>
+          <w:sz w:val="21"/>
+          <w:szCs w:val="21"/>
+        </w:rPr>
+        <w:t>Git</w:t>
+      </w:r>
+      <w:r>
+        <w:rPr>
+          <w:rFonts w:ascii="Garamond" w:hAnsi="Garamond" w:cs="Arial"/>
+          <w:sz w:val="21"/>
+          <w:szCs w:val="21"/>
+        </w:rPr>
+        <w:t xml:space="preserve">, </w:t>
+      </w:r>
+      <w:r>
+        <w:rPr>
+          <w:rFonts w:ascii="Garamond" w:hAnsi="Garamond" w:cs="Arial"/>
+          <w:iCs/>
+          <w:sz w:val="21"/>
+          <w:szCs w:val="21"/>
+        </w:rPr>
         <w:t xml:space="preserve">Linux, </w:t>
       </w:r>
       <w:r>
@@ -664,141 +748,7 @@
           <w:sz w:val="21"/>
           <w:szCs w:val="21"/>
         </w:rPr>
-        <w:t xml:space="preserve">Linux command line, </w:t>
-      </w:r>
-      <w:r>
-        <w:rPr>
-          <w:rFonts w:ascii="Garamond" w:hAnsi="Garamond" w:cs="Arial"/>
-          <w:iCs/>
-          <w:sz w:val="21"/>
-          <w:szCs w:val="21"/>
-        </w:rPr>
-        <w:t xml:space="preserve">ROS, ROS2, Python, </w:t>
-      </w:r>
-      <w:proofErr w:type="spellStart"/>
-      <w:r>
-        <w:rPr>
-          <w:rFonts w:ascii="Garamond" w:hAnsi="Garamond" w:cs="Arial"/>
-          <w:iCs/>
-          <w:sz w:val="21"/>
-          <w:szCs w:val="21"/>
-        </w:rPr>
-        <w:t>Pytorch</w:t>
-      </w:r>
-      <w:proofErr w:type="spellEnd"/>
-      <w:r>
-        <w:rPr>
-          <w:rFonts w:ascii="Garamond" w:hAnsi="Garamond" w:cs="Arial"/>
-          <w:iCs/>
-          <w:sz w:val="21"/>
-          <w:szCs w:val="21"/>
-        </w:rPr>
-        <w:t xml:space="preserve">, </w:t>
-      </w:r>
-      <w:r>
-        <w:rPr>
-          <w:rFonts w:ascii="Garamond" w:hAnsi="Garamond" w:cs="Arial"/>
-          <w:iCs/>
-          <w:sz w:val="21"/>
-          <w:szCs w:val="21"/>
-        </w:rPr>
-        <w:t xml:space="preserve">C++, </w:t>
-      </w:r>
-      <w:proofErr w:type="spellStart"/>
-      <w:r>
-        <w:rPr>
-          <w:rFonts w:ascii="Garamond" w:hAnsi="Garamond" w:cs="Arial"/>
-          <w:iCs/>
-          <w:sz w:val="21"/>
-          <w:szCs w:val="21"/>
-        </w:rPr>
-        <w:t>Matlab</w:t>
-      </w:r>
-      <w:proofErr w:type="spellEnd"/>
-      <w:r>
-        <w:rPr>
-          <w:rFonts w:ascii="Garamond" w:hAnsi="Garamond" w:cs="Arial"/>
-          <w:iCs/>
-          <w:sz w:val="21"/>
-          <w:szCs w:val="21"/>
-        </w:rPr>
-        <w:t xml:space="preserve">, Arduino IDE, </w:t>
-      </w:r>
-      <w:r>
-        <w:rPr>
-          <w:rFonts w:ascii="Garamond" w:hAnsi="Garamond" w:cs="Arial"/>
-          <w:sz w:val="21"/>
-          <w:szCs w:val="21"/>
-        </w:rPr>
-        <w:t>Simulator (</w:t>
-      </w:r>
-      <w:proofErr w:type="spellStart"/>
-      <w:r>
-        <w:rPr>
-          <w:rFonts w:ascii="Garamond" w:hAnsi="Garamond" w:cs="Arial"/>
-          <w:sz w:val="21"/>
-          <w:szCs w:val="21"/>
-        </w:rPr>
-        <w:t>CoppeliaSim</w:t>
-      </w:r>
-      <w:proofErr w:type="spellEnd"/>
-      <w:r>
-        <w:rPr>
-          <w:rFonts w:ascii="Garamond" w:hAnsi="Garamond" w:cs="Arial"/>
-          <w:sz w:val="21"/>
-          <w:szCs w:val="21"/>
-        </w:rPr>
-        <w:t xml:space="preserve">, Simulink), OpenCV, </w:t>
-      </w:r>
-      <w:r>
-        <w:rPr>
-          <w:rFonts w:ascii="Garamond" w:hAnsi="Garamond" w:cs="Arial"/>
-          <w:sz w:val="21"/>
-          <w:szCs w:val="21"/>
-        </w:rPr>
-        <w:t>CAD</w:t>
-      </w:r>
-      <w:r>
-        <w:rPr>
-          <w:rFonts w:ascii="Garamond" w:hAnsi="Garamond" w:cs="Arial"/>
-          <w:sz w:val="21"/>
-          <w:szCs w:val="21"/>
-        </w:rPr>
-        <w:t xml:space="preserve"> (</w:t>
-      </w:r>
-      <w:proofErr w:type="spellStart"/>
-      <w:r>
-        <w:rPr>
-          <w:rFonts w:ascii="Garamond" w:hAnsi="Garamond" w:cs="Arial"/>
-          <w:sz w:val="21"/>
-          <w:szCs w:val="21"/>
-        </w:rPr>
-        <w:t>Autoware</w:t>
-      </w:r>
-      <w:proofErr w:type="spellEnd"/>
-      <w:r>
-        <w:rPr>
-          <w:rFonts w:ascii="Garamond" w:hAnsi="Garamond" w:cs="Arial"/>
-          <w:sz w:val="21"/>
-          <w:szCs w:val="21"/>
-        </w:rPr>
-        <w:t>, SolidWorks)</w:t>
-      </w:r>
-      <w:r>
-        <w:rPr>
-          <w:rFonts w:ascii="Garamond" w:hAnsi="Garamond" w:cs="Arial"/>
-          <w:sz w:val="21"/>
-          <w:szCs w:val="21"/>
-        </w:rPr>
-        <w:t>, Mobile Robots</w:t>
-      </w:r>
-      <w:r>
-        <w:rPr>
-          <w:rFonts w:ascii="Garamond" w:hAnsi="Garamond" w:cs="Arial"/>
-          <w:sz w:val="21"/>
-          <w:szCs w:val="21"/>
-        </w:rPr>
-        <w:t>, Git</w:t>
+        <w:t>Linux command line</w:t>
       </w:r>
     </w:p>
     <w:p>
@@ -957,23 +907,23 @@
           <w:sz w:val="21"/>
           <w:szCs w:val="21"/>
         </w:rPr>
-        <w:t xml:space="preserve">Written and </w:t>
-      </w:r>
-      <w:r>
-        <w:rPr>
-          <w:rFonts w:ascii="Garamond" w:hAnsi="Garamond" w:cs="Arial"/>
-          <w:sz w:val="21"/>
-          <w:szCs w:val="21"/>
-        </w:rPr>
-        <w:t>v</w:t>
-      </w:r>
-      <w:r>
-        <w:rPr>
-          <w:rFonts w:ascii="Garamond" w:hAnsi="Garamond" w:cs="Arial"/>
-          <w:sz w:val="21"/>
-          <w:szCs w:val="21"/>
-        </w:rPr>
-        <w:t xml:space="preserve">erbal </w:t>
+        <w:t>Written and v</w:t>
+      </w:r>
+      <w:r>
+        <w:rPr>
+          <w:rFonts w:ascii="Garamond" w:hAnsi="Garamond" w:cs="Arial"/>
+          <w:sz w:val="21"/>
+          <w:szCs w:val="21"/>
+        </w:rPr>
+        <w:t>erbal</w:t>
+      </w:r>
+      <w:r>
+        <w:rPr>
+          <w:rFonts w:ascii="Garamond" w:hAnsi="Garamond" w:cs="Arial"/>
+          <w:sz w:val="21"/>
+          <w:szCs w:val="21"/>
+        </w:rPr>
+        <w:t xml:space="preserve"> </w:t>
       </w:r>
       <w:r>
         <w:rPr>
@@ -1005,23 +955,15 @@
           <w:sz w:val="21"/>
           <w:szCs w:val="21"/>
         </w:rPr>
-        <w:t xml:space="preserve">, Problem </w:t>
-      </w:r>
-      <w:r>
-        <w:rPr>
-          <w:rFonts w:ascii="Garamond" w:hAnsi="Garamond" w:cs="Arial"/>
-          <w:sz w:val="21"/>
-          <w:szCs w:val="21"/>
-        </w:rPr>
-        <w:t>s</w:t>
-      </w:r>
-      <w:r>
-        <w:rPr>
-          <w:rFonts w:ascii="Garamond" w:hAnsi="Garamond" w:cs="Arial"/>
-          <w:sz w:val="21"/>
-          <w:szCs w:val="21"/>
-        </w:rPr>
-        <w:t>olving</w:t>
+        <w:t xml:space="preserve">, </w:t>
+      </w:r>
+      <w:r>
+        <w:rPr>
+          <w:rFonts w:ascii="Garamond" w:hAnsi="Garamond" w:cs="Arial"/>
+          <w:sz w:val="21"/>
+          <w:szCs w:val="21"/>
+        </w:rPr>
+        <w:t>Troubleshooting</w:t>
       </w:r>
     </w:p>
     <w:p>
@@ -1405,7 +1347,6 @@
         </w:rPr>
         <w:t xml:space="preserve">Designed and built </w:t>
       </w:r>
-      <w:proofErr w:type="gramStart"/>
       <w:r>
         <w:rPr>
           <w:rFonts w:ascii="Garamond" w:hAnsi="Garamond" w:cs="Arial"/>
@@ -1414,7 +1355,6 @@
         </w:rPr>
         <w:t>map</w:t>
       </w:r>
-      <w:proofErr w:type="gramEnd"/>
       <w:r>
         <w:rPr>
           <w:rFonts w:ascii="Garamond" w:hAnsi="Garamond" w:cs="Arial"/>
@@ -1559,25 +1499,7 @@
           <w:sz w:val="21"/>
           <w:szCs w:val="21"/>
         </w:rPr>
-        <w:t xml:space="preserve"> that </w:t>
-      </w:r>
-      <w:proofErr w:type="gramStart"/>
-      <w:r>
-        <w:rPr>
-          <w:rFonts w:ascii="Garamond" w:hAnsi="Garamond" w:cs="Arial"/>
-          <w:sz w:val="21"/>
-          <w:szCs w:val="21"/>
-        </w:rPr>
-        <w:t>processed</w:t>
-      </w:r>
-      <w:proofErr w:type="gramEnd"/>
-      <w:r>
-        <w:rPr>
-          <w:rFonts w:ascii="Garamond" w:hAnsi="Garamond" w:cs="Arial"/>
-          <w:sz w:val="21"/>
-          <w:szCs w:val="21"/>
-        </w:rPr>
-        <w:t xml:space="preserve"> </w:t>
+        <w:t xml:space="preserve"> that processed </w:t>
       </w:r>
       <w:r>
         <w:rPr>
@@ -1601,25 +1523,7 @@
           <w:sz w:val="21"/>
           <w:szCs w:val="21"/>
         </w:rPr>
-        <w:t xml:space="preserve">signals from </w:t>
-      </w:r>
-      <w:proofErr w:type="gramStart"/>
-      <w:r>
-        <w:rPr>
-          <w:rFonts w:ascii="Garamond" w:hAnsi="Garamond" w:cs="Arial"/>
-          <w:sz w:val="21"/>
-          <w:szCs w:val="21"/>
-        </w:rPr>
-        <w:t>cars;</w:t>
-      </w:r>
-      <w:proofErr w:type="gramEnd"/>
-      <w:r>
-        <w:rPr>
-          <w:rFonts w:ascii="Garamond" w:hAnsi="Garamond" w:cs="Arial"/>
-          <w:sz w:val="21"/>
-          <w:szCs w:val="21"/>
-        </w:rPr>
-        <w:t xml:space="preserve"> </w:t>
+        <w:t xml:space="preserve">signals from cars; </w:t>
       </w:r>
       <w:r>
         <w:rPr>
@@ -1754,7 +1658,6 @@
           <w:szCs w:val="21"/>
         </w:rPr>
       </w:pPr>
-      <w:proofErr w:type="gramStart"/>
       <w:r>
         <w:rPr>
           <w:rFonts w:ascii="Garamond" w:hAnsi="Garamond" w:cs="Arial"/>
@@ -1763,7 +1666,6 @@
         </w:rPr>
         <w:t>Communicated</w:t>
       </w:r>
-      <w:proofErr w:type="gramEnd"/>
       <w:r>
         <w:rPr>
           <w:rFonts w:ascii="Garamond" w:hAnsi="Garamond" w:cs="Arial"/>
@@ -2413,25 +2315,7 @@
           <w:sz w:val="21"/>
           <w:szCs w:val="21"/>
         </w:rPr>
-        <w:t xml:space="preserve">; successfully made </w:t>
-      </w:r>
-      <w:proofErr w:type="gramStart"/>
-      <w:r>
-        <w:rPr>
-          <w:rFonts w:ascii="Garamond" w:hAnsi="Garamond" w:cs="Arial"/>
-          <w:sz w:val="21"/>
-          <w:szCs w:val="21"/>
-        </w:rPr>
-        <w:t>car</w:t>
-      </w:r>
-      <w:proofErr w:type="gramEnd"/>
-      <w:r>
-        <w:rPr>
-          <w:rFonts w:ascii="Garamond" w:hAnsi="Garamond" w:cs="Arial"/>
-          <w:sz w:val="21"/>
-          <w:szCs w:val="21"/>
-        </w:rPr>
-        <w:t xml:space="preserve"> run </w:t>
+        <w:t xml:space="preserve">; successfully made car run </w:t>
       </w:r>
       <w:r>
         <w:rPr>
@@ -2703,16 +2587,7 @@
           <w:sz w:val="21"/>
           <w:szCs w:val="21"/>
         </w:rPr>
-        <w:t xml:space="preserve"> Extended Kalman </w:t>
-      </w:r>
-      <w:proofErr w:type="gramStart"/>
-      <w:r>
-        <w:rPr>
-          <w:rFonts w:ascii="Garamond" w:hAnsi="Garamond" w:cs="Arial"/>
-          <w:sz w:val="21"/>
-          <w:szCs w:val="21"/>
-        </w:rPr>
-        <w:t>Filter</w:t>
+        <w:t xml:space="preserve"> Extended Kalman Filter</w:t>
       </w:r>
       <w:r>
         <w:rPr>
@@ -2722,7 +2597,6 @@
         </w:rPr>
         <w:t>;</w:t>
       </w:r>
-      <w:proofErr w:type="gramEnd"/>
       <w:r>
         <w:rPr>
           <w:rFonts w:ascii="Garamond" w:hAnsi="Garamond" w:cs="Arial"/>
@@ -3139,19 +3013,8 @@
           <w:sz w:val="21"/>
           <w:szCs w:val="21"/>
         </w:rPr>
-        <w:t xml:space="preserve">, </w:t>
-      </w:r>
-      <w:proofErr w:type="spellStart"/>
-      <w:r>
-        <w:rPr>
-          <w:rFonts w:ascii="Garamond" w:hAnsi="Garamond" w:cs="Arial"/>
-          <w:i/>
-          <w:sz w:val="21"/>
-          <w:szCs w:val="21"/>
-        </w:rPr>
-        <w:t>CoppeliaSim</w:t>
-      </w:r>
-      <w:proofErr w:type="spellEnd"/>
+        <w:t>, CoppeliaSim</w:t>
+      </w:r>
       <w:r>
         <w:rPr>
           <w:rFonts w:ascii="Garamond" w:hAnsi="Garamond" w:cs="Arial"/>

</xml_diff>

<commit_message>
Aptiv, Autonomous Driving Algorithm Intern
</commit_message>
<xml_diff>
--- a/Marika_Nishi_Resume.docx
+++ b/Marika_Nishi_Resume.docx
@@ -34,7 +34,7 @@
           <w:rFonts w:ascii="Times New Roman" w:hAnsi="Times New Roman" w:cs="Times New Roman"/>
           <w:szCs w:val="12"/>
         </w:rPr>
-        <w:t>Embedded Software/Firmware Summer 2025 Internships</w:t>
+        <w:t>Autonomous Driving Algorithm Intern</w:t>
       </w:r>
     </w:p>
     <w:p>
@@ -640,6 +640,15 @@
           <w:sz w:val="21"/>
           <w:szCs w:val="21"/>
         </w:rPr>
+        <w:t xml:space="preserve">Autonomous driving algorithms, </w:t>
+      </w:r>
+      <w:r>
+        <w:rPr>
+          <w:rFonts w:ascii="Garamond" w:hAnsi="Garamond" w:cs="Arial"/>
+          <w:iCs/>
+          <w:sz w:val="21"/>
+          <w:szCs w:val="21"/>
+        </w:rPr>
         <w:t xml:space="preserve">ROS, ROS2, Python, Pytorch, </w:t>
       </w:r>
       <w:r>
@@ -723,32 +732,6 @@
           <w:szCs w:val="21"/>
         </w:rPr>
         <w:t>Git</w:t>
-      </w:r>
-      <w:r>
-        <w:rPr>
-          <w:rFonts w:ascii="Garamond" w:hAnsi="Garamond" w:cs="Arial"/>
-          <w:sz w:val="21"/>
-          <w:szCs w:val="21"/>
-        </w:rPr>
-        <w:t xml:space="preserve">, </w:t>
-      </w:r>
-      <w:r>
-        <w:rPr>
-          <w:rFonts w:ascii="Garamond" w:hAnsi="Garamond" w:cs="Arial"/>
-          <w:iCs/>
-          <w:sz w:val="21"/>
-          <w:szCs w:val="21"/>
-        </w:rPr>
-        <w:t xml:space="preserve">Linux, </w:t>
-      </w:r>
-      <w:r>
-        <w:rPr>
-          <w:rFonts w:ascii="Garamond" w:hAnsi="Garamond" w:cs="Arial"/>
-          <w:iCs/>
-          <w:sz w:val="21"/>
-          <w:szCs w:val="21"/>
-        </w:rPr>
-        <w:t>Linux command line</w:t>
       </w:r>
     </w:p>
     <w:p>
@@ -779,7 +762,31 @@
           <w:sz w:val="21"/>
           <w:szCs w:val="21"/>
         </w:rPr>
-        <w:t>operating systems</w:t>
+        <w:t>Kalman Filter,</w:t>
+      </w:r>
+      <w:r>
+        <w:rPr>
+          <w:rFonts w:ascii="Garamond" w:hAnsi="Garamond" w:cs="Arial"/>
+          <w:sz w:val="21"/>
+          <w:szCs w:val="21"/>
+        </w:rPr>
+        <w:t xml:space="preserve"> </w:t>
+      </w:r>
+      <w:r>
+        <w:rPr>
+          <w:rFonts w:ascii="Garamond" w:hAnsi="Garamond" w:cs="Arial"/>
+          <w:sz w:val="21"/>
+          <w:szCs w:val="21"/>
+        </w:rPr>
+        <w:t>LiDAR</w:t>
+      </w:r>
+      <w:r>
+        <w:rPr>
+          <w:rFonts w:ascii="Garamond" w:hAnsi="Garamond" w:cs="Arial"/>
+          <w:sz w:val="21"/>
+          <w:szCs w:val="21"/>
+        </w:rPr>
+        <w:t>, RGB camera, IMU, RTK-GPS, low-accuracy GPS</w:t>
       </w:r>
       <w:r>
         <w:rPr>
@@ -795,39 +802,7 @@
           <w:sz w:val="21"/>
           <w:szCs w:val="21"/>
         </w:rPr>
-        <w:t xml:space="preserve">edge computing, </w:t>
-      </w:r>
-      <w:r>
-        <w:rPr>
-          <w:rFonts w:ascii="Garamond" w:hAnsi="Garamond" w:cs="Arial"/>
-          <w:sz w:val="21"/>
-          <w:szCs w:val="21"/>
-        </w:rPr>
-        <w:t>Kalman Filter,</w:t>
-      </w:r>
-      <w:r>
-        <w:rPr>
-          <w:rFonts w:ascii="Garamond" w:hAnsi="Garamond" w:cs="Arial"/>
-          <w:sz w:val="21"/>
-          <w:szCs w:val="21"/>
-        </w:rPr>
-        <w:t xml:space="preserve"> </w:t>
-      </w:r>
-      <w:r>
-        <w:rPr>
-          <w:rFonts w:ascii="Garamond" w:hAnsi="Garamond" w:cs="Arial"/>
-          <w:sz w:val="21"/>
-          <w:szCs w:val="21"/>
-        </w:rPr>
-        <w:t>LiDAR</w:t>
-      </w:r>
-      <w:r>
-        <w:rPr>
-          <w:rFonts w:ascii="Garamond" w:hAnsi="Garamond" w:cs="Arial"/>
-          <w:sz w:val="21"/>
-          <w:szCs w:val="21"/>
-        </w:rPr>
-        <w:t>, RGB camera, IMU, RTK-GPS, low-accuracy GPS</w:t>
+        <w:t>Edge computing</w:t>
       </w:r>
     </w:p>
     <w:p>
@@ -867,7 +842,15 @@
           <w:sz w:val="21"/>
           <w:szCs w:val="21"/>
         </w:rPr>
-        <w:t xml:space="preserve">Research and </w:t>
+        <w:t>Research, Design</w:t>
+      </w:r>
+      <w:r>
+        <w:rPr>
+          <w:rFonts w:ascii="Garamond" w:hAnsi="Garamond" w:cs="Arial"/>
+          <w:sz w:val="21"/>
+          <w:szCs w:val="21"/>
+        </w:rPr>
+        <w:t xml:space="preserve"> and </w:t>
       </w:r>
       <w:r>
         <w:rPr>
@@ -884,14 +867,6 @@
           <w:szCs w:val="21"/>
         </w:rPr>
         <w:t>evelopment,</w:t>
-      </w:r>
-      <w:r>
-        <w:rPr>
-          <w:rFonts w:ascii="Garamond" w:hAnsi="Garamond" w:cs="Arial"/>
-          <w:sz w:val="21"/>
-          <w:szCs w:val="21"/>
-        </w:rPr>
-        <w:t xml:space="preserve"> Analysis,</w:t>
       </w:r>
       <w:r>
         <w:rPr>
@@ -1664,7 +1639,23 @@
           <w:sz w:val="21"/>
           <w:szCs w:val="21"/>
         </w:rPr>
-        <w:t>Communicated</w:t>
+        <w:t>Co</w:t>
+      </w:r>
+      <w:r>
+        <w:rPr>
+          <w:rFonts w:ascii="Garamond" w:hAnsi="Garamond" w:cs="Arial"/>
+          <w:sz w:val="21"/>
+          <w:szCs w:val="21"/>
+        </w:rPr>
+        <w:t>llabora</w:t>
+      </w:r>
+      <w:r>
+        <w:rPr>
+          <w:rFonts w:ascii="Garamond" w:hAnsi="Garamond" w:cs="Arial"/>
+          <w:sz w:val="21"/>
+          <w:szCs w:val="21"/>
+        </w:rPr>
+        <w:t>ted</w:t>
       </w:r>
       <w:r>
         <w:rPr>
@@ -3013,16 +3004,16 @@
           <w:sz w:val="21"/>
           <w:szCs w:val="21"/>
         </w:rPr>
-        <w:t>, CoppeliaSim</w:t>
-      </w:r>
-      <w:r>
-        <w:rPr>
-          <w:rFonts w:ascii="Garamond" w:hAnsi="Garamond" w:cs="Arial"/>
-          <w:i/>
-          <w:sz w:val="21"/>
-          <w:szCs w:val="21"/>
-        </w:rPr>
-        <w:t>, Arduino</w:t>
+        <w:t xml:space="preserve">, </w:t>
+      </w:r>
+      <w:r>
+        <w:rPr>
+          <w:rFonts w:ascii="Garamond" w:hAnsi="Garamond" w:cs="Arial"/>
+          <w:i/>
+          <w:sz w:val="21"/>
+          <w:szCs w:val="21"/>
+        </w:rPr>
+        <w:t>Arduino</w:t>
       </w:r>
       <w:r>
         <w:rPr>
@@ -3032,6 +3023,15 @@
           <w:szCs w:val="21"/>
         </w:rPr>
         <w:t xml:space="preserve"> IDE</w:t>
+      </w:r>
+      <w:r>
+        <w:rPr>
+          <w:rFonts w:ascii="Garamond" w:hAnsi="Garamond" w:cs="Arial"/>
+          <w:i/>
+          <w:sz w:val="21"/>
+          <w:szCs w:val="21"/>
+        </w:rPr>
+        <w:t>, Creativity</w:t>
       </w:r>
       <w:r>
         <w:rPr>
@@ -4355,15 +4355,6 @@
 </file>
 
 <file path=customXml/item1.xml><?xml version="1.0" encoding="utf-8"?>
-<?mso-contentType ?>
-<FormTemplates xmlns="http://schemas.microsoft.com/sharepoint/v3/contenttype/forms">
-  <Display>DocumentLibraryForm</Display>
-  <Edit>DocumentLibraryForm</Edit>
-  <New>DocumentLibraryForm</New>
-</FormTemplates>
-</file>
-
-<file path=customXml/item2.xml><?xml version="1.0" encoding="utf-8"?>
 <ct:contentTypeSchema xmlns:ct="http://schemas.microsoft.com/office/2006/metadata/contentType" xmlns:ma="http://schemas.microsoft.com/office/2006/metadata/properties/metaAttributes" ct:_="" ma:_="" ma:contentTypeName="Document" ma:contentTypeID="0x010100E00F7205C82CFC49993A09459E403F9D" ma:contentTypeVersion="11" ma:contentTypeDescription="Create a new document." ma:contentTypeScope="" ma:versionID="15ca1506d9d0bc3d30df8ed0110f0d4e">
   <xsd:schema xmlns:xsd="http://www.w3.org/2001/XMLSchema" xmlns:xs="http://www.w3.org/2001/XMLSchema" xmlns:p="http://schemas.microsoft.com/office/2006/metadata/properties" xmlns:ns2="8f1b7c86-42c5-4929-b887-8cfd13270314" xmlns:ns3="671c1944-cc4f-476c-949f-52559c641db4" targetNamespace="http://schemas.microsoft.com/office/2006/metadata/properties" ma:root="true" ma:fieldsID="db6c2aada95e6879eb2870ebec6b4aa1" ns2:_="" ns3:_="">
     <xsd:import namespace="8f1b7c86-42c5-4929-b887-8cfd13270314"/>
@@ -4574,15 +4565,16 @@
 </ct:contentTypeSchema>
 </file>
 
-<file path=customXml/itemProps1.xml><?xml version="1.0" encoding="utf-8"?>
-<ds:datastoreItem xmlns:ds="http://schemas.openxmlformats.org/officeDocument/2006/customXml" ds:itemID="{8E8AFA64-578D-46FF-A288-428D1FA7C9F1}">
-  <ds:schemaRefs>
-    <ds:schemaRef ds:uri="http://schemas.microsoft.com/sharepoint/v3/contenttype/forms"/>
-  </ds:schemaRefs>
-</ds:datastoreItem>
+<file path=customXml/item2.xml><?xml version="1.0" encoding="utf-8"?>
+<?mso-contentType ?>
+<FormTemplates xmlns="http://schemas.microsoft.com/sharepoint/v3/contenttype/forms">
+  <Display>DocumentLibraryForm</Display>
+  <Edit>DocumentLibraryForm</Edit>
+  <New>DocumentLibraryForm</New>
+</FormTemplates>
 </file>
 
-<file path=customXml/itemProps2.xml><?xml version="1.0" encoding="utf-8"?>
+<file path=customXml/itemProps1.xml><?xml version="1.0" encoding="utf-8"?>
 <ds:datastoreItem xmlns:ds="http://schemas.openxmlformats.org/officeDocument/2006/customXml" ds:itemID="{5ECCFF00-82E4-439E-8D62-678F77120EF2}">
   <ds:schemaRefs>
     <ds:schemaRef ds:uri="http://schemas.microsoft.com/office/2006/metadata/contentType"/>
@@ -4599,4 +4591,12 @@
     <ds:schemaRef ds:uri="http://schemas.microsoft.com/internal/obd"/>
   </ds:schemaRefs>
 </ds:datastoreItem>
+</file>
+
+<file path=customXml/itemProps2.xml><?xml version="1.0" encoding="utf-8"?>
+<ds:datastoreItem xmlns:ds="http://schemas.openxmlformats.org/officeDocument/2006/customXml" ds:itemID="{8E8AFA64-578D-46FF-A288-428D1FA7C9F1}">
+  <ds:schemaRefs>
+    <ds:schemaRef ds:uri="http://schemas.microsoft.com/sharepoint/v3/contenttype/forms"/>
+  </ds:schemaRefs>
+</ds:datastoreItem>
 </file>
</xml_diff>

<commit_message>
pony.ai perception software engineer robotics
</commit_message>
<xml_diff>
--- a/Marika_Nishi_Resume.docx
+++ b/Marika_Nishi_Resume.docx
@@ -5,10 +5,11 @@
     <w:p>
       <w:pPr>
         <w:tabs>
+          <w:tab w:val="center" w:pos="5256"/>
+          <w:tab w:val="left" w:pos="6972"/>
           <w:tab w:val="right" w:pos="10440"/>
         </w:tabs>
         <w:spacing w:after="0" w:line="240" w:lineRule="auto"/>
-        <w:jc w:val="center"/>
         <w:rPr>
           <w:rFonts w:ascii="Garamond" w:hAnsi="Garamond" w:cs="Arial"/>
           <w:sz w:val="32"/>
@@ -20,14 +21,36 @@
           <w:rFonts w:ascii="Times New Roman" w:hAnsi="Times New Roman" w:cs="Times New Roman"/>
           <w:sz w:val="40"/>
         </w:rPr>
-        <w:t>Marika Nishi</w:t>
+        <w:tab/>
       </w:r>
       <w:r>
         <w:rPr>
           <w:rFonts w:ascii="Times New Roman" w:hAnsi="Times New Roman" w:cs="Times New Roman"/>
           <w:sz w:val="40"/>
         </w:rPr>
+        <w:t>Marika Nishi</w:t>
+      </w:r>
+      <w:r>
+        <w:rPr>
+          <w:rFonts w:ascii="Times New Roman" w:hAnsi="Times New Roman" w:cs="Times New Roman"/>
+          <w:sz w:val="40"/>
+        </w:rPr>
         <w:t xml:space="preserve"> </w:t>
+      </w:r>
+      <w:r>
+        <w:rPr>
+          <w:rFonts w:ascii="Times New Roman" w:hAnsi="Times New Roman" w:cs="Times New Roman"/>
+          <w:sz w:val="20"/>
+          <w:szCs w:val="10"/>
+        </w:rPr>
+        <w:t>Software Engineer, Perception (Robotics)</w:t>
+      </w:r>
+      <w:r>
+        <w:rPr>
+          <w:rFonts w:ascii="Times New Roman" w:hAnsi="Times New Roman" w:cs="Times New Roman"/>
+          <w:sz w:val="40"/>
+        </w:rPr>
+        <w:tab/>
       </w:r>
     </w:p>
     <w:p>
@@ -4618,15 +4641,6 @@
 </file>
 
 <file path=customXml/item1.xml><?xml version="1.0" encoding="utf-8"?>
-<?mso-contentType ?>
-<FormTemplates xmlns="http://schemas.microsoft.com/sharepoint/v3/contenttype/forms">
-  <Display>DocumentLibraryForm</Display>
-  <Edit>DocumentLibraryForm</Edit>
-  <New>DocumentLibraryForm</New>
-</FormTemplates>
-</file>
-
-<file path=customXml/item2.xml><?xml version="1.0" encoding="utf-8"?>
 <ct:contentTypeSchema xmlns:ct="http://schemas.microsoft.com/office/2006/metadata/contentType" xmlns:ma="http://schemas.microsoft.com/office/2006/metadata/properties/metaAttributes" ct:_="" ma:_="" ma:contentTypeName="Document" ma:contentTypeID="0x010100E00F7205C82CFC49993A09459E403F9D" ma:contentTypeVersion="11" ma:contentTypeDescription="Create a new document." ma:contentTypeScope="" ma:versionID="15ca1506d9d0bc3d30df8ed0110f0d4e">
   <xsd:schema xmlns:xsd="http://www.w3.org/2001/XMLSchema" xmlns:xs="http://www.w3.org/2001/XMLSchema" xmlns:p="http://schemas.microsoft.com/office/2006/metadata/properties" xmlns:ns2="8f1b7c86-42c5-4929-b887-8cfd13270314" xmlns:ns3="671c1944-cc4f-476c-949f-52559c641db4" targetNamespace="http://schemas.microsoft.com/office/2006/metadata/properties" ma:root="true" ma:fieldsID="db6c2aada95e6879eb2870ebec6b4aa1" ns2:_="" ns3:_="">
     <xsd:import namespace="8f1b7c86-42c5-4929-b887-8cfd13270314"/>
@@ -4837,15 +4851,16 @@
 </ct:contentTypeSchema>
 </file>
 
-<file path=customXml/itemProps1.xml><?xml version="1.0" encoding="utf-8"?>
-<ds:datastoreItem xmlns:ds="http://schemas.openxmlformats.org/officeDocument/2006/customXml" ds:itemID="{8E8AFA64-578D-46FF-A288-428D1FA7C9F1}">
-  <ds:schemaRefs>
-    <ds:schemaRef ds:uri="http://schemas.microsoft.com/sharepoint/v3/contenttype/forms"/>
-  </ds:schemaRefs>
-</ds:datastoreItem>
+<file path=customXml/item2.xml><?xml version="1.0" encoding="utf-8"?>
+<?mso-contentType ?>
+<FormTemplates xmlns="http://schemas.microsoft.com/sharepoint/v3/contenttype/forms">
+  <Display>DocumentLibraryForm</Display>
+  <Edit>DocumentLibraryForm</Edit>
+  <New>DocumentLibraryForm</New>
+</FormTemplates>
 </file>
 
-<file path=customXml/itemProps2.xml><?xml version="1.0" encoding="utf-8"?>
+<file path=customXml/itemProps1.xml><?xml version="1.0" encoding="utf-8"?>
 <ds:datastoreItem xmlns:ds="http://schemas.openxmlformats.org/officeDocument/2006/customXml" ds:itemID="{5ECCFF00-82E4-439E-8D62-678F77120EF2}">
   <ds:schemaRefs>
     <ds:schemaRef ds:uri="http://schemas.microsoft.com/office/2006/metadata/contentType"/>
@@ -4862,4 +4877,12 @@
     <ds:schemaRef ds:uri="http://schemas.microsoft.com/internal/obd"/>
   </ds:schemaRefs>
 </ds:datastoreItem>
+</file>
+
+<file path=customXml/itemProps2.xml><?xml version="1.0" encoding="utf-8"?>
+<ds:datastoreItem xmlns:ds="http://schemas.openxmlformats.org/officeDocument/2006/customXml" ds:itemID="{8E8AFA64-578D-46FF-A288-428D1FA7C9F1}">
+  <ds:schemaRefs>
+    <ds:schemaRef ds:uri="http://schemas.microsoft.com/sharepoint/v3/contenttype/forms"/>
+  </ds:schemaRefs>
+</ds:datastoreItem>
 </file>
</xml_diff>

<commit_message>
intrinsic Robotics Software Engineer
</commit_message>
<xml_diff>
--- a/Marika_Nishi_Resume.docx
+++ b/Marika_Nishi_Resume.docx
@@ -40,10 +40,9 @@
       <w:r>
         <w:rPr>
           <w:rFonts w:ascii="Times New Roman" w:hAnsi="Times New Roman" w:cs="Times New Roman"/>
-          <w:sz w:val="20"/>
-          <w:szCs w:val="10"/>
-        </w:rPr>
-        <w:t>Software Engineer, Perception (Robotics)</w:t>
+          <w:szCs w:val="12"/>
+        </w:rPr>
+        <w:t>Robotics Software Engineer</w:t>
       </w:r>
       <w:r>
         <w:rPr>
@@ -752,7 +751,7 @@
           <w:sz w:val="21"/>
           <w:szCs w:val="21"/>
         </w:rPr>
-        <w:t>, ROS1, ROS2</w:t>
+        <w:t>, ROS</w:t>
       </w:r>
       <w:r>
         <w:rPr>
@@ -769,15 +768,49 @@
           <w:sz w:val="21"/>
           <w:szCs w:val="21"/>
         </w:rPr>
-        <w:t xml:space="preserve">Simulator, </w:t>
-      </w:r>
-      <w:r>
-        <w:rPr>
-          <w:rFonts w:ascii="Garamond" w:hAnsi="Garamond" w:cs="Arial"/>
-          <w:sz w:val="21"/>
-          <w:szCs w:val="21"/>
-        </w:rPr>
-        <w:t xml:space="preserve">Software development, Embedded software, Vehicle software, </w:t>
+        <w:t>Simulator</w:t>
+      </w:r>
+      <w:r>
+        <w:rPr>
+          <w:rFonts w:ascii="Garamond" w:hAnsi="Garamond" w:cs="Arial"/>
+          <w:sz w:val="21"/>
+          <w:szCs w:val="21"/>
+        </w:rPr>
+        <w:t xml:space="preserve"> (Gazebo, </w:t>
+      </w:r>
+      <w:proofErr w:type="spellStart"/>
+      <w:r>
+        <w:rPr>
+          <w:rFonts w:ascii="Garamond" w:hAnsi="Garamond" w:cs="Arial"/>
+          <w:sz w:val="21"/>
+          <w:szCs w:val="21"/>
+        </w:rPr>
+        <w:t>MuJoCo</w:t>
+      </w:r>
+      <w:proofErr w:type="spellEnd"/>
+      <w:r>
+        <w:rPr>
+          <w:rFonts w:ascii="Garamond" w:hAnsi="Garamond" w:cs="Arial"/>
+          <w:sz w:val="21"/>
+          <w:szCs w:val="21"/>
+        </w:rPr>
+        <w:t>)</w:t>
+      </w:r>
+      <w:r>
+        <w:rPr>
+          <w:rFonts w:ascii="Garamond" w:hAnsi="Garamond" w:cs="Arial"/>
+          <w:sz w:val="21"/>
+          <w:szCs w:val="21"/>
+        </w:rPr>
+        <w:t xml:space="preserve">, </w:t>
+      </w:r>
+      <w:r>
+        <w:rPr>
+          <w:rFonts w:ascii="Garamond" w:hAnsi="Garamond" w:cs="Arial"/>
+          <w:sz w:val="21"/>
+          <w:szCs w:val="21"/>
+        </w:rPr>
+        <w:t xml:space="preserve">Software development, Vehicle software, </w:t>
       </w:r>
       <w:r>
         <w:rPr>
@@ -922,22 +955,6 @@
           <w:sz w:val="21"/>
           <w:szCs w:val="21"/>
         </w:rPr>
-        <w:t xml:space="preserve">CAD, Statistics, 3D Printing, </w:t>
-      </w:r>
-      <w:r>
-        <w:rPr>
-          <w:rFonts w:ascii="Garamond" w:hAnsi="Garamond" w:cs="Arial"/>
-          <w:sz w:val="21"/>
-          <w:szCs w:val="21"/>
-        </w:rPr>
-        <w:t xml:space="preserve">Fabrication, </w:t>
-      </w:r>
-      <w:r>
-        <w:rPr>
-          <w:rFonts w:ascii="Garamond" w:hAnsi="Garamond" w:cs="Arial"/>
-          <w:sz w:val="21"/>
-          <w:szCs w:val="21"/>
-        </w:rPr>
         <w:t>LiDAR</w:t>
       </w:r>
       <w:r>
@@ -954,7 +971,23 @@
           <w:sz w:val="21"/>
           <w:szCs w:val="21"/>
         </w:rPr>
-        <w:t>, Additive Manufacturing</w:t>
+        <w:t xml:space="preserve">, </w:t>
+      </w:r>
+      <w:r>
+        <w:rPr>
+          <w:rFonts w:ascii="Garamond" w:hAnsi="Garamond" w:cs="Arial"/>
+          <w:sz w:val="21"/>
+          <w:szCs w:val="21"/>
+        </w:rPr>
+        <w:t xml:space="preserve">CAD, 3D Printing, Fabrication, </w:t>
+      </w:r>
+      <w:r>
+        <w:rPr>
+          <w:rFonts w:ascii="Garamond" w:hAnsi="Garamond" w:cs="Arial"/>
+          <w:sz w:val="21"/>
+          <w:szCs w:val="21"/>
+        </w:rPr>
+        <w:t>Additive Manufacturing</w:t>
       </w:r>
     </w:p>
     <w:p>
@@ -3342,7 +3375,16 @@
           <w:sz w:val="21"/>
           <w:szCs w:val="21"/>
         </w:rPr>
-        <w:t xml:space="preserve"> Extended Kalman Filter</w:t>
+        <w:t xml:space="preserve"> Extended Kalman </w:t>
+      </w:r>
+      <w:proofErr w:type="gramStart"/>
+      <w:r>
+        <w:rPr>
+          <w:rFonts w:ascii="Garamond" w:hAnsi="Garamond" w:cs="Arial"/>
+          <w:sz w:val="21"/>
+          <w:szCs w:val="21"/>
+        </w:rPr>
+        <w:t>Filter</w:t>
       </w:r>
       <w:r>
         <w:rPr>
@@ -3352,6 +3394,7 @@
         </w:rPr>
         <w:t>;</w:t>
       </w:r>
+      <w:proofErr w:type="gramEnd"/>
       <w:r>
         <w:rPr>
           <w:rFonts w:ascii="Garamond" w:hAnsi="Garamond" w:cs="Arial"/>

</xml_diff>

<commit_message>
Burro Perception, Planning and Control Engineer
</commit_message>
<xml_diff>
--- a/Marika_Nishi_Resume.docx
+++ b/Marika_Nishi_Resume.docx
@@ -43,7 +43,15 @@
           <w:sz w:val="18"/>
           <w:szCs w:val="8"/>
         </w:rPr>
-        <w:t>Robotics Software Developer</w:t>
+        <w:t xml:space="preserve">Robotics Software </w:t>
+      </w:r>
+      <w:r>
+        <w:rPr>
+          <w:rFonts w:ascii="Times New Roman" w:hAnsi="Times New Roman" w:cs="Times New Roman"/>
+          <w:sz w:val="18"/>
+          <w:szCs w:val="8"/>
+        </w:rPr>
+        <w:t>Engineer, Perception, Planning, and Control</w:t>
       </w:r>
       <w:r>
         <w:rPr>
@@ -147,7 +155,27 @@
             <w:sz w:val="18"/>
             <w:szCs w:val="18"/>
           </w:rPr>
-          <w:t>linkedin.com/in/marika-nishi/</w:t>
+          <w:t>linkedin.com/in/</w:t>
+        </w:r>
+        <w:proofErr w:type="spellStart"/>
+        <w:r>
+          <w:rPr>
+            <w:rStyle w:val="Hyperlink"/>
+            <w:rFonts w:ascii="Garamond" w:hAnsi="Garamond" w:cs="Arial"/>
+            <w:sz w:val="18"/>
+            <w:szCs w:val="18"/>
+          </w:rPr>
+          <w:t>marika-nishi</w:t>
+        </w:r>
+        <w:proofErr w:type="spellEnd"/>
+        <w:r>
+          <w:rPr>
+            <w:rStyle w:val="Hyperlink"/>
+            <w:rFonts w:ascii="Garamond" w:hAnsi="Garamond" w:cs="Arial"/>
+            <w:sz w:val="18"/>
+            <w:szCs w:val="18"/>
+          </w:rPr>
+          <w:t>/</w:t>
         </w:r>
       </w:hyperlink>
       <w:r>
@@ -740,14 +768,25 @@
         </w:rPr>
         <w:t xml:space="preserve">, </w:t>
       </w:r>
-      <w:r>
-        <w:rPr>
-          <w:rFonts w:ascii="Garamond" w:hAnsi="Garamond" w:cs="Arial"/>
-          <w:iCs/>
-          <w:sz w:val="21"/>
-          <w:szCs w:val="21"/>
-        </w:rPr>
-        <w:t xml:space="preserve">Pytorch, </w:t>
+      <w:proofErr w:type="spellStart"/>
+      <w:r>
+        <w:rPr>
+          <w:rFonts w:ascii="Garamond" w:hAnsi="Garamond" w:cs="Arial"/>
+          <w:iCs/>
+          <w:sz w:val="21"/>
+          <w:szCs w:val="21"/>
+        </w:rPr>
+        <w:t>Pytorch</w:t>
+      </w:r>
+      <w:proofErr w:type="spellEnd"/>
+      <w:r>
+        <w:rPr>
+          <w:rFonts w:ascii="Garamond" w:hAnsi="Garamond" w:cs="Arial"/>
+          <w:iCs/>
+          <w:sz w:val="21"/>
+          <w:szCs w:val="21"/>
+        </w:rPr>
+        <w:t xml:space="preserve">, </w:t>
       </w:r>
       <w:r>
         <w:rPr>
@@ -771,7 +810,25 @@
           <w:sz w:val="21"/>
           <w:szCs w:val="21"/>
         </w:rPr>
-        <w:t xml:space="preserve"> (Gazebo, MuJoCo)</w:t>
+        <w:t xml:space="preserve"> (Gazebo, </w:t>
+      </w:r>
+      <w:proofErr w:type="spellStart"/>
+      <w:r>
+        <w:rPr>
+          <w:rFonts w:ascii="Garamond" w:hAnsi="Garamond" w:cs="Arial"/>
+          <w:sz w:val="21"/>
+          <w:szCs w:val="21"/>
+        </w:rPr>
+        <w:t>MuJoCo</w:t>
+      </w:r>
+      <w:proofErr w:type="spellEnd"/>
+      <w:r>
+        <w:rPr>
+          <w:rFonts w:ascii="Garamond" w:hAnsi="Garamond" w:cs="Arial"/>
+          <w:sz w:val="21"/>
+          <w:szCs w:val="21"/>
+        </w:rPr>
+        <w:t>)</w:t>
       </w:r>
       <w:r>
         <w:rPr>
@@ -829,16 +886,45 @@
           <w:sz w:val="21"/>
           <w:szCs w:val="21"/>
         </w:rPr>
-        <w:t xml:space="preserve">Neural Netowrks, </w:t>
-      </w:r>
-      <w:r>
-        <w:rPr>
-          <w:rFonts w:ascii="Garamond" w:hAnsi="Garamond" w:cs="Arial"/>
-          <w:iCs/>
-          <w:sz w:val="21"/>
-          <w:szCs w:val="21"/>
-        </w:rPr>
-        <w:t xml:space="preserve">Matlab, </w:t>
+        <w:t xml:space="preserve">Neural </w:t>
+      </w:r>
+      <w:proofErr w:type="spellStart"/>
+      <w:r>
+        <w:rPr>
+          <w:rFonts w:ascii="Garamond" w:hAnsi="Garamond" w:cs="Arial"/>
+          <w:sz w:val="21"/>
+          <w:szCs w:val="21"/>
+        </w:rPr>
+        <w:t>Netowrks</w:t>
+      </w:r>
+      <w:proofErr w:type="spellEnd"/>
+      <w:r>
+        <w:rPr>
+          <w:rFonts w:ascii="Garamond" w:hAnsi="Garamond" w:cs="Arial"/>
+          <w:sz w:val="21"/>
+          <w:szCs w:val="21"/>
+        </w:rPr>
+        <w:t xml:space="preserve">, </w:t>
+      </w:r>
+      <w:proofErr w:type="spellStart"/>
+      <w:r>
+        <w:rPr>
+          <w:rFonts w:ascii="Garamond" w:hAnsi="Garamond" w:cs="Arial"/>
+          <w:iCs/>
+          <w:sz w:val="21"/>
+          <w:szCs w:val="21"/>
+        </w:rPr>
+        <w:t>Matlab</w:t>
+      </w:r>
+      <w:proofErr w:type="spellEnd"/>
+      <w:r>
+        <w:rPr>
+          <w:rFonts w:ascii="Garamond" w:hAnsi="Garamond" w:cs="Arial"/>
+          <w:iCs/>
+          <w:sz w:val="21"/>
+          <w:szCs w:val="21"/>
+        </w:rPr>
+        <w:t xml:space="preserve">, </w:t>
       </w:r>
       <w:r>
         <w:rPr>
@@ -1717,6 +1803,7 @@
           <w:szCs w:val="21"/>
         </w:rPr>
       </w:pPr>
+      <w:proofErr w:type="spellStart"/>
       <w:r>
         <w:rPr>
           <w:rFonts w:ascii="Garamond" w:hAnsi="Garamond" w:cs="Arial"/>
@@ -1726,6 +1813,7 @@
         </w:rPr>
         <w:t>ModLab</w:t>
       </w:r>
+      <w:proofErr w:type="spellEnd"/>
       <w:r>
         <w:rPr>
           <w:rFonts w:ascii="Garamond" w:hAnsi="Garamond" w:cs="Arial"/>
@@ -2641,7 +2729,23 @@
           <w:sz w:val="21"/>
           <w:szCs w:val="21"/>
         </w:rPr>
-        <w:t xml:space="preserve"> by operating the machines and inspecting products</w:t>
+        <w:t xml:space="preserve"> by operating </w:t>
+      </w:r>
+      <w:r>
+        <w:rPr>
+          <w:rFonts w:ascii="Garamond" w:hAnsi="Garamond" w:cs="Arial"/>
+          <w:sz w:val="21"/>
+          <w:szCs w:val="21"/>
+        </w:rPr>
+        <w:t xml:space="preserve">the </w:t>
+      </w:r>
+      <w:r>
+        <w:rPr>
+          <w:rFonts w:ascii="Garamond" w:hAnsi="Garamond" w:cs="Arial"/>
+          <w:sz w:val="21"/>
+          <w:szCs w:val="21"/>
+        </w:rPr>
+        <w:t>machines and inspecting products</w:t>
       </w:r>
     </w:p>
     <w:p>
@@ -2683,7 +2787,23 @@
           <w:sz w:val="21"/>
           <w:szCs w:val="21"/>
         </w:rPr>
-        <w:t xml:space="preserve"> by observing machine structures</w:t>
+        <w:t xml:space="preserve"> by </w:t>
+      </w:r>
+      <w:r>
+        <w:rPr>
+          <w:rFonts w:ascii="Garamond" w:hAnsi="Garamond" w:cs="Arial"/>
+          <w:sz w:val="21"/>
+          <w:szCs w:val="21"/>
+        </w:rPr>
+        <w:t>examining</w:t>
+      </w:r>
+      <w:r>
+        <w:rPr>
+          <w:rFonts w:ascii="Garamond" w:hAnsi="Garamond" w:cs="Arial"/>
+          <w:sz w:val="21"/>
+          <w:szCs w:val="21"/>
+        </w:rPr>
+        <w:t xml:space="preserve"> machine structures</w:t>
       </w:r>
       <w:r>
         <w:rPr>
@@ -2843,25 +2963,43 @@
           <w:sz w:val="21"/>
           <w:szCs w:val="21"/>
         </w:rPr>
+        <w:t>Perception</w:t>
+      </w:r>
+      <w:r>
+        <w:rPr>
+          <w:rFonts w:ascii="Garamond" w:hAnsi="Garamond" w:cs="Arial"/>
+          <w:i/>
+          <w:sz w:val="21"/>
+          <w:szCs w:val="21"/>
+        </w:rPr>
+        <w:t xml:space="preserve">, </w:t>
+      </w:r>
+      <w:r>
+        <w:rPr>
+          <w:rFonts w:ascii="Garamond" w:hAnsi="Garamond" w:cs="Arial"/>
+          <w:i/>
+          <w:sz w:val="21"/>
+          <w:szCs w:val="21"/>
+        </w:rPr>
+        <w:t xml:space="preserve">Planning, </w:t>
+      </w:r>
+      <w:r>
+        <w:rPr>
+          <w:rFonts w:ascii="Garamond" w:hAnsi="Garamond" w:cs="Arial"/>
+          <w:i/>
+          <w:sz w:val="21"/>
+          <w:szCs w:val="21"/>
+        </w:rPr>
+        <w:t xml:space="preserve">Control, </w:t>
+      </w:r>
+      <w:r>
+        <w:rPr>
+          <w:rFonts w:ascii="Garamond" w:hAnsi="Garamond" w:cs="Arial"/>
+          <w:i/>
+          <w:sz w:val="21"/>
+          <w:szCs w:val="21"/>
+        </w:rPr>
         <w:t xml:space="preserve">Autonomous Driving, </w:t>
-      </w:r>
-      <w:r>
-        <w:rPr>
-          <w:rFonts w:ascii="Garamond" w:hAnsi="Garamond" w:cs="Arial"/>
-          <w:i/>
-          <w:sz w:val="21"/>
-          <w:szCs w:val="21"/>
-        </w:rPr>
-        <w:t xml:space="preserve">Motion Planning, </w:t>
-      </w:r>
-      <w:r>
-        <w:rPr>
-          <w:rFonts w:ascii="Garamond" w:hAnsi="Garamond" w:cs="Arial"/>
-          <w:i/>
-          <w:sz w:val="21"/>
-          <w:szCs w:val="21"/>
-        </w:rPr>
-        <w:t xml:space="preserve">Control, </w:t>
       </w:r>
       <w:r>
         <w:rPr>
@@ -4631,6 +4769,15 @@
 </file>
 
 <file path=customXml/item1.xml><?xml version="1.0" encoding="utf-8"?>
+<?mso-contentType ?>
+<FormTemplates xmlns="http://schemas.microsoft.com/sharepoint/v3/contenttype/forms">
+  <Display>DocumentLibraryForm</Display>
+  <Edit>DocumentLibraryForm</Edit>
+  <New>DocumentLibraryForm</New>
+</FormTemplates>
+</file>
+
+<file path=customXml/item2.xml><?xml version="1.0" encoding="utf-8"?>
 <ct:contentTypeSchema xmlns:ct="http://schemas.microsoft.com/office/2006/metadata/contentType" xmlns:ma="http://schemas.microsoft.com/office/2006/metadata/properties/metaAttributes" ct:_="" ma:_="" ma:contentTypeName="Document" ma:contentTypeID="0x010100E00F7205C82CFC49993A09459E403F9D" ma:contentTypeVersion="11" ma:contentTypeDescription="Create a new document." ma:contentTypeScope="" ma:versionID="15ca1506d9d0bc3d30df8ed0110f0d4e">
   <xsd:schema xmlns:xsd="http://www.w3.org/2001/XMLSchema" xmlns:xs="http://www.w3.org/2001/XMLSchema" xmlns:p="http://schemas.microsoft.com/office/2006/metadata/properties" xmlns:ns2="8f1b7c86-42c5-4929-b887-8cfd13270314" xmlns:ns3="671c1944-cc4f-476c-949f-52559c641db4" targetNamespace="http://schemas.microsoft.com/office/2006/metadata/properties" ma:root="true" ma:fieldsID="db6c2aada95e6879eb2870ebec6b4aa1" ns2:_="" ns3:_="">
     <xsd:import namespace="8f1b7c86-42c5-4929-b887-8cfd13270314"/>
@@ -4841,16 +4988,15 @@
 </ct:contentTypeSchema>
 </file>
 
-<file path=customXml/item2.xml><?xml version="1.0" encoding="utf-8"?>
-<?mso-contentType ?>
-<FormTemplates xmlns="http://schemas.microsoft.com/sharepoint/v3/contenttype/forms">
-  <Display>DocumentLibraryForm</Display>
-  <Edit>DocumentLibraryForm</Edit>
-  <New>DocumentLibraryForm</New>
-</FormTemplates>
+<file path=customXml/itemProps1.xml><?xml version="1.0" encoding="utf-8"?>
+<ds:datastoreItem xmlns:ds="http://schemas.openxmlformats.org/officeDocument/2006/customXml" ds:itemID="{8E8AFA64-578D-46FF-A288-428D1FA7C9F1}">
+  <ds:schemaRefs>
+    <ds:schemaRef ds:uri="http://schemas.microsoft.com/sharepoint/v3/contenttype/forms"/>
+  </ds:schemaRefs>
+</ds:datastoreItem>
 </file>
 
-<file path=customXml/itemProps1.xml><?xml version="1.0" encoding="utf-8"?>
+<file path=customXml/itemProps2.xml><?xml version="1.0" encoding="utf-8"?>
 <ds:datastoreItem xmlns:ds="http://schemas.openxmlformats.org/officeDocument/2006/customXml" ds:itemID="{5ECCFF00-82E4-439E-8D62-678F77120EF2}">
   <ds:schemaRefs>
     <ds:schemaRef ds:uri="http://schemas.microsoft.com/office/2006/metadata/contentType"/>
@@ -4867,12 +5013,4 @@
     <ds:schemaRef ds:uri="http://schemas.microsoft.com/internal/obd"/>
   </ds:schemaRefs>
 </ds:datastoreItem>
-</file>
-
-<file path=customXml/itemProps2.xml><?xml version="1.0" encoding="utf-8"?>
-<ds:datastoreItem xmlns:ds="http://schemas.openxmlformats.org/officeDocument/2006/customXml" ds:itemID="{8E8AFA64-578D-46FF-A288-428D1FA7C9F1}">
-  <ds:schemaRefs>
-    <ds:schemaRef ds:uri="http://schemas.microsoft.com/sharepoint/v3/contenttype/forms"/>
-  </ds:schemaRefs>
-</ds:datastoreItem>
 </file>
</xml_diff>

<commit_message>
Oho Group Ltd, Mechatronics Engineer
</commit_message>
<xml_diff>
--- a/Marika_Nishi_Resume.docx
+++ b/Marika_Nishi_Resume.docx
@@ -43,15 +43,7 @@
           <w:sz w:val="18"/>
           <w:szCs w:val="8"/>
         </w:rPr>
-        <w:t xml:space="preserve">Robotics Software </w:t>
-      </w:r>
-      <w:r>
-        <w:rPr>
-          <w:rFonts w:ascii="Times New Roman" w:hAnsi="Times New Roman" w:cs="Times New Roman"/>
-          <w:sz w:val="18"/>
-          <w:szCs w:val="8"/>
-        </w:rPr>
-        <w:t>Engineer, Perception, Planning, and Control</w:t>
+        <w:t>Mechatronics Engineer</w:t>
       </w:r>
       <w:r>
         <w:rPr>
@@ -155,27 +147,7 @@
             <w:sz w:val="18"/>
             <w:szCs w:val="18"/>
           </w:rPr>
-          <w:t>linkedin.com/in/</w:t>
-        </w:r>
-        <w:proofErr w:type="spellStart"/>
-        <w:r>
-          <w:rPr>
-            <w:rStyle w:val="Hyperlink"/>
-            <w:rFonts w:ascii="Garamond" w:hAnsi="Garamond" w:cs="Arial"/>
-            <w:sz w:val="18"/>
-            <w:szCs w:val="18"/>
-          </w:rPr>
-          <w:t>marika-nishi</w:t>
-        </w:r>
-        <w:proofErr w:type="spellEnd"/>
-        <w:r>
-          <w:rPr>
-            <w:rStyle w:val="Hyperlink"/>
-            <w:rFonts w:ascii="Garamond" w:hAnsi="Garamond" w:cs="Arial"/>
-            <w:sz w:val="18"/>
-            <w:szCs w:val="18"/>
-          </w:rPr>
-          <w:t>/</w:t>
+          <w:t>linkedin.com/in/marika-nishi/</w:t>
         </w:r>
       </w:hyperlink>
       <w:r>
@@ -735,6 +707,14 @@
       <w:r>
         <w:rPr>
           <w:rFonts w:ascii="Garamond" w:hAnsi="Garamond" w:cs="Arial"/>
+          <w:sz w:val="21"/>
+          <w:szCs w:val="21"/>
+        </w:rPr>
+        <w:t xml:space="preserve">CAD, 3D Printing, Fabrication, </w:t>
+      </w:r>
+      <w:r>
+        <w:rPr>
+          <w:rFonts w:ascii="Garamond" w:hAnsi="Garamond" w:cs="Arial"/>
           <w:iCs/>
           <w:sz w:val="21"/>
           <w:szCs w:val="21"/>
@@ -768,21 +748,42 @@
         </w:rPr>
         <w:t xml:space="preserve">, </w:t>
       </w:r>
-      <w:proofErr w:type="spellStart"/>
-      <w:r>
-        <w:rPr>
-          <w:rFonts w:ascii="Garamond" w:hAnsi="Garamond" w:cs="Arial"/>
-          <w:iCs/>
-          <w:sz w:val="21"/>
-          <w:szCs w:val="21"/>
-        </w:rPr>
-        <w:t>Pytorch</w:t>
-      </w:r>
-      <w:proofErr w:type="spellEnd"/>
-      <w:r>
-        <w:rPr>
-          <w:rFonts w:ascii="Garamond" w:hAnsi="Garamond" w:cs="Arial"/>
-          <w:iCs/>
+      <w:r>
+        <w:rPr>
+          <w:rFonts w:ascii="Garamond" w:hAnsi="Garamond" w:cs="Arial"/>
+          <w:iCs/>
+          <w:sz w:val="21"/>
+          <w:szCs w:val="21"/>
+        </w:rPr>
+        <w:t xml:space="preserve">Pytorch, </w:t>
+      </w:r>
+      <w:r>
+        <w:rPr>
+          <w:rFonts w:ascii="Garamond" w:hAnsi="Garamond" w:cs="Arial"/>
+          <w:sz w:val="21"/>
+          <w:szCs w:val="21"/>
+        </w:rPr>
+        <w:t xml:space="preserve">OpenCV, </w:t>
+      </w:r>
+      <w:r>
+        <w:rPr>
+          <w:rFonts w:ascii="Garamond" w:hAnsi="Garamond" w:cs="Arial"/>
+          <w:sz w:val="21"/>
+          <w:szCs w:val="21"/>
+        </w:rPr>
+        <w:t>Simulator</w:t>
+      </w:r>
+      <w:r>
+        <w:rPr>
+          <w:rFonts w:ascii="Garamond" w:hAnsi="Garamond" w:cs="Arial"/>
+          <w:sz w:val="21"/>
+          <w:szCs w:val="21"/>
+        </w:rPr>
+        <w:t xml:space="preserve"> (Gazebo, MuJoCo)</w:t>
+      </w:r>
+      <w:r>
+        <w:rPr>
+          <w:rFonts w:ascii="Garamond" w:hAnsi="Garamond" w:cs="Arial"/>
           <w:sz w:val="21"/>
           <w:szCs w:val="21"/>
         </w:rPr>
@@ -794,57 +795,39 @@
           <w:sz w:val="21"/>
           <w:szCs w:val="21"/>
         </w:rPr>
-        <w:t xml:space="preserve">OpenCV, </w:t>
-      </w:r>
-      <w:r>
-        <w:rPr>
-          <w:rFonts w:ascii="Garamond" w:hAnsi="Garamond" w:cs="Arial"/>
-          <w:sz w:val="21"/>
-          <w:szCs w:val="21"/>
-        </w:rPr>
-        <w:t>Simulator</w:t>
-      </w:r>
-      <w:r>
-        <w:rPr>
-          <w:rFonts w:ascii="Garamond" w:hAnsi="Garamond" w:cs="Arial"/>
-          <w:sz w:val="21"/>
-          <w:szCs w:val="21"/>
-        </w:rPr>
-        <w:t xml:space="preserve"> (Gazebo, </w:t>
-      </w:r>
-      <w:proofErr w:type="spellStart"/>
-      <w:r>
-        <w:rPr>
-          <w:rFonts w:ascii="Garamond" w:hAnsi="Garamond" w:cs="Arial"/>
-          <w:sz w:val="21"/>
-          <w:szCs w:val="21"/>
-        </w:rPr>
-        <w:t>MuJoCo</w:t>
-      </w:r>
-      <w:proofErr w:type="spellEnd"/>
-      <w:r>
-        <w:rPr>
-          <w:rFonts w:ascii="Garamond" w:hAnsi="Garamond" w:cs="Arial"/>
-          <w:sz w:val="21"/>
-          <w:szCs w:val="21"/>
-        </w:rPr>
-        <w:t>)</w:t>
-      </w:r>
-      <w:r>
-        <w:rPr>
-          <w:rFonts w:ascii="Garamond" w:hAnsi="Garamond" w:cs="Arial"/>
-          <w:sz w:val="21"/>
-          <w:szCs w:val="21"/>
-        </w:rPr>
-        <w:t xml:space="preserve">, </w:t>
-      </w:r>
-      <w:r>
-        <w:rPr>
-          <w:rFonts w:ascii="Garamond" w:hAnsi="Garamond" w:cs="Arial"/>
-          <w:sz w:val="21"/>
-          <w:szCs w:val="21"/>
-        </w:rPr>
-        <w:t xml:space="preserve">SLAM, sensor fusion, </w:t>
+        <w:t xml:space="preserve">SLAM, </w:t>
+      </w:r>
+      <w:r>
+        <w:rPr>
+          <w:rFonts w:ascii="Garamond" w:hAnsi="Garamond" w:cs="Arial"/>
+          <w:sz w:val="21"/>
+          <w:szCs w:val="21"/>
+        </w:rPr>
+        <w:t>S</w:t>
+      </w:r>
+      <w:r>
+        <w:rPr>
+          <w:rFonts w:ascii="Garamond" w:hAnsi="Garamond" w:cs="Arial"/>
+          <w:sz w:val="21"/>
+          <w:szCs w:val="21"/>
+        </w:rPr>
+        <w:t xml:space="preserve">ensor </w:t>
+      </w:r>
+      <w:r>
+        <w:rPr>
+          <w:rFonts w:ascii="Garamond" w:hAnsi="Garamond" w:cs="Arial"/>
+          <w:sz w:val="21"/>
+          <w:szCs w:val="21"/>
+        </w:rPr>
+        <w:t>F</w:t>
+      </w:r>
+      <w:r>
+        <w:rPr>
+          <w:rFonts w:ascii="Garamond" w:hAnsi="Garamond" w:cs="Arial"/>
+          <w:sz w:val="21"/>
+          <w:szCs w:val="21"/>
+        </w:rPr>
+        <w:t xml:space="preserve">usion, </w:t>
       </w:r>
       <w:r>
         <w:rPr>
@@ -878,62 +861,33 @@
           <w:sz w:val="21"/>
           <w:szCs w:val="21"/>
         </w:rPr>
-        <w:t xml:space="preserve">Segmentation, </w:t>
-      </w:r>
-      <w:r>
-        <w:rPr>
-          <w:rFonts w:ascii="Garamond" w:hAnsi="Garamond" w:cs="Arial"/>
-          <w:sz w:val="21"/>
-          <w:szCs w:val="21"/>
-        </w:rPr>
-        <w:t xml:space="preserve">Neural </w:t>
-      </w:r>
-      <w:proofErr w:type="spellStart"/>
-      <w:r>
-        <w:rPr>
-          <w:rFonts w:ascii="Garamond" w:hAnsi="Garamond" w:cs="Arial"/>
-          <w:sz w:val="21"/>
-          <w:szCs w:val="21"/>
-        </w:rPr>
-        <w:t>Netowrks</w:t>
-      </w:r>
-      <w:proofErr w:type="spellEnd"/>
-      <w:r>
-        <w:rPr>
-          <w:rFonts w:ascii="Garamond" w:hAnsi="Garamond" w:cs="Arial"/>
-          <w:sz w:val="21"/>
-          <w:szCs w:val="21"/>
-        </w:rPr>
-        <w:t xml:space="preserve">, </w:t>
-      </w:r>
-      <w:proofErr w:type="spellStart"/>
-      <w:r>
-        <w:rPr>
-          <w:rFonts w:ascii="Garamond" w:hAnsi="Garamond" w:cs="Arial"/>
-          <w:iCs/>
-          <w:sz w:val="21"/>
-          <w:szCs w:val="21"/>
-        </w:rPr>
-        <w:t>Matlab</w:t>
-      </w:r>
-      <w:proofErr w:type="spellEnd"/>
-      <w:r>
-        <w:rPr>
-          <w:rFonts w:ascii="Garamond" w:hAnsi="Garamond" w:cs="Arial"/>
-          <w:iCs/>
-          <w:sz w:val="21"/>
-          <w:szCs w:val="21"/>
-        </w:rPr>
-        <w:t xml:space="preserve">, </w:t>
-      </w:r>
-      <w:r>
-        <w:rPr>
-          <w:rFonts w:ascii="Garamond" w:hAnsi="Garamond" w:cs="Arial"/>
-          <w:iCs/>
-          <w:sz w:val="21"/>
-          <w:szCs w:val="21"/>
-        </w:rPr>
-        <w:t>Autonomous driving algorithms, ADAS</w:t>
+        <w:t>Segmentation,</w:t>
+      </w:r>
+      <w:r>
+        <w:rPr>
+          <w:rFonts w:ascii="Garamond" w:hAnsi="Garamond" w:cs="Arial"/>
+          <w:sz w:val="21"/>
+          <w:szCs w:val="21"/>
+        </w:rPr>
+        <w:t xml:space="preserve"> </w:t>
+      </w:r>
+      <w:r>
+        <w:rPr>
+          <w:rFonts w:ascii="Garamond" w:hAnsi="Garamond" w:cs="Arial"/>
+          <w:iCs/>
+          <w:sz w:val="21"/>
+          <w:szCs w:val="21"/>
+        </w:rPr>
+        <w:t xml:space="preserve">Matlab, </w:t>
+      </w:r>
+      <w:r>
+        <w:rPr>
+          <w:rFonts w:ascii="Garamond" w:hAnsi="Garamond" w:cs="Arial"/>
+          <w:iCs/>
+          <w:sz w:val="21"/>
+          <w:szCs w:val="21"/>
+        </w:rPr>
+        <w:t>Autonomous driving, ADAS</w:t>
       </w:r>
       <w:r>
         <w:rPr>
@@ -1039,14 +993,6 @@
           <w:sz w:val="21"/>
           <w:szCs w:val="21"/>
         </w:rPr>
-        <w:t xml:space="preserve">CAD, 3D Printing, Fabrication, </w:t>
-      </w:r>
-      <w:r>
-        <w:rPr>
-          <w:rFonts w:ascii="Garamond" w:hAnsi="Garamond" w:cs="Arial"/>
-          <w:sz w:val="21"/>
-          <w:szCs w:val="21"/>
-        </w:rPr>
         <w:t>Additive Manufacturing</w:t>
       </w:r>
     </w:p>
@@ -1097,6 +1043,7 @@
         </w:rPr>
         <w:t xml:space="preserve"> and </w:t>
       </w:r>
+      <w:proofErr w:type="gramStart"/>
       <w:r>
         <w:rPr>
           <w:rFonts w:ascii="Garamond" w:hAnsi="Garamond" w:cs="Arial"/>
@@ -1111,7 +1058,16 @@
           <w:sz w:val="21"/>
           <w:szCs w:val="21"/>
         </w:rPr>
-        <w:t>evelopment,</w:t>
+        <w:t>evelopment</w:t>
+      </w:r>
+      <w:proofErr w:type="gramEnd"/>
+      <w:r>
+        <w:rPr>
+          <w:rFonts w:ascii="Garamond" w:hAnsi="Garamond" w:cs="Arial"/>
+          <w:sz w:val="21"/>
+          <w:szCs w:val="21"/>
+        </w:rPr>
+        <w:t>,</w:t>
       </w:r>
       <w:r>
         <w:rPr>
@@ -1199,15 +1155,15 @@
           <w:sz w:val="21"/>
           <w:szCs w:val="21"/>
         </w:rPr>
-        <w:t xml:space="preserve">Machine Learning; </w:t>
-      </w:r>
-      <w:r>
-        <w:rPr>
-          <w:rFonts w:ascii="Garamond" w:hAnsi="Garamond" w:cs="Arial"/>
-          <w:sz w:val="21"/>
-          <w:szCs w:val="21"/>
-        </w:rPr>
-        <w:t xml:space="preserve">Deep Generative Models; </w:t>
+        <w:t>Mechatronics; Automotive Engineering;</w:t>
+      </w:r>
+      <w:r>
+        <w:rPr>
+          <w:rFonts w:ascii="Garamond" w:hAnsi="Garamond" w:cs="Arial"/>
+          <w:sz w:val="21"/>
+          <w:szCs w:val="21"/>
+        </w:rPr>
+        <w:t xml:space="preserve"> </w:t>
       </w:r>
       <w:r>
         <w:rPr>
@@ -1247,23 +1203,7 @@
           <w:sz w:val="21"/>
           <w:szCs w:val="21"/>
         </w:rPr>
-        <w:t xml:space="preserve">Mechatronics; </w:t>
-      </w:r>
-      <w:r>
-        <w:rPr>
-          <w:rFonts w:ascii="Garamond" w:hAnsi="Garamond" w:cs="Arial"/>
-          <w:sz w:val="21"/>
-          <w:szCs w:val="21"/>
-        </w:rPr>
-        <w:t>Automotive Engineering</w:t>
-      </w:r>
-      <w:r>
-        <w:rPr>
-          <w:rFonts w:ascii="Garamond" w:hAnsi="Garamond" w:cs="Arial"/>
-          <w:sz w:val="21"/>
-          <w:szCs w:val="21"/>
-        </w:rPr>
-        <w:t xml:space="preserve">; Advanced Robotics; </w:t>
+        <w:t xml:space="preserve">Advanced Robotics; </w:t>
       </w:r>
       <w:r>
         <w:rPr>
@@ -1304,6 +1244,30 @@
           <w:szCs w:val="21"/>
         </w:rPr>
         <w:t>Dynamics and Control</w:t>
+      </w:r>
+      <w:r>
+        <w:rPr>
+          <w:rFonts w:ascii="Garamond" w:hAnsi="Garamond" w:cs="Arial"/>
+          <w:sz w:val="21"/>
+          <w:szCs w:val="21"/>
+        </w:rPr>
+        <w:t>;</w:t>
+      </w:r>
+      <w:r>
+        <w:rPr>
+          <w:rFonts w:ascii="Garamond" w:hAnsi="Garamond" w:cs="Arial"/>
+          <w:sz w:val="21"/>
+          <w:szCs w:val="21"/>
+        </w:rPr>
+        <w:t xml:space="preserve"> </w:t>
+      </w:r>
+      <w:r>
+        <w:rPr>
+          <w:rFonts w:ascii="Garamond" w:hAnsi="Garamond" w:cs="Arial"/>
+          <w:sz w:val="21"/>
+          <w:szCs w:val="21"/>
+        </w:rPr>
+        <w:t>Machine Learning; Deep Generative Models</w:t>
       </w:r>
     </w:p>
     <w:p>
@@ -1803,7 +1767,6 @@
           <w:szCs w:val="21"/>
         </w:rPr>
       </w:pPr>
-      <w:proofErr w:type="spellStart"/>
       <w:r>
         <w:rPr>
           <w:rFonts w:ascii="Garamond" w:hAnsi="Garamond" w:cs="Arial"/>
@@ -1813,7 +1776,6 @@
         </w:rPr>
         <w:t>ModLab</w:t>
       </w:r>
-      <w:proofErr w:type="spellEnd"/>
       <w:r>
         <w:rPr>
           <w:rFonts w:ascii="Garamond" w:hAnsi="Garamond" w:cs="Arial"/>
@@ -1918,6 +1880,15 @@
           <w:sz w:val="21"/>
           <w:szCs w:val="21"/>
         </w:rPr>
+        <w:t xml:space="preserve"> ROS2</w:t>
+      </w:r>
+      <w:r>
+        <w:rPr>
+          <w:rFonts w:ascii="Garamond" w:hAnsi="Garamond" w:cs="Arial"/>
+          <w:bCs/>
+          <w:sz w:val="21"/>
+          <w:szCs w:val="21"/>
+        </w:rPr>
         <w:t xml:space="preserve"> computer vision system that detect</w:t>
       </w:r>
       <w:r>
@@ -2180,6 +2151,7 @@
         </w:rPr>
         <w:t xml:space="preserve">Designed and built </w:t>
       </w:r>
+      <w:proofErr w:type="gramStart"/>
       <w:r>
         <w:rPr>
           <w:rFonts w:ascii="Garamond" w:hAnsi="Garamond" w:cs="Arial"/>
@@ -2188,6 +2160,7 @@
         </w:rPr>
         <w:t>map</w:t>
       </w:r>
+      <w:proofErr w:type="gramEnd"/>
       <w:r>
         <w:rPr>
           <w:rFonts w:ascii="Garamond" w:hAnsi="Garamond" w:cs="Arial"/>
@@ -2364,15 +2337,33 @@
           <w:sz w:val="21"/>
           <w:szCs w:val="21"/>
         </w:rPr>
-        <w:t xml:space="preserve"> by fixing CAN signal decoding</w:t>
-      </w:r>
-      <w:r>
-        <w:rPr>
-          <w:rFonts w:ascii="Garamond" w:hAnsi="Garamond" w:cs="Arial"/>
-          <w:sz w:val="21"/>
-          <w:szCs w:val="21"/>
-        </w:rPr>
-        <w:t xml:space="preserve">; </w:t>
+        <w:t xml:space="preserve"> by fixing CAN signal </w:t>
+      </w:r>
+      <w:proofErr w:type="gramStart"/>
+      <w:r>
+        <w:rPr>
+          <w:rFonts w:ascii="Garamond" w:hAnsi="Garamond" w:cs="Arial"/>
+          <w:sz w:val="21"/>
+          <w:szCs w:val="21"/>
+        </w:rPr>
+        <w:t>decoding</w:t>
+      </w:r>
+      <w:r>
+        <w:rPr>
+          <w:rFonts w:ascii="Garamond" w:hAnsi="Garamond" w:cs="Arial"/>
+          <w:sz w:val="21"/>
+          <w:szCs w:val="21"/>
+        </w:rPr>
+        <w:t>;</w:t>
+      </w:r>
+      <w:proofErr w:type="gramEnd"/>
+      <w:r>
+        <w:rPr>
+          <w:rFonts w:ascii="Garamond" w:hAnsi="Garamond" w:cs="Arial"/>
+          <w:sz w:val="21"/>
+          <w:szCs w:val="21"/>
+        </w:rPr>
+        <w:t xml:space="preserve"> </w:t>
       </w:r>
       <w:r>
         <w:rPr>
@@ -3261,7 +3252,27 @@
           <w:sz w:val="21"/>
           <w:szCs w:val="21"/>
         </w:rPr>
-        <w:t xml:space="preserve">Extended Kalman Filter , </w:t>
+        <w:t xml:space="preserve">Extended Kalman </w:t>
+      </w:r>
+      <w:proofErr w:type="gramStart"/>
+      <w:r>
+        <w:rPr>
+          <w:rFonts w:ascii="Garamond" w:hAnsi="Garamond" w:cs="Arial"/>
+          <w:i/>
+          <w:sz w:val="21"/>
+          <w:szCs w:val="21"/>
+        </w:rPr>
+        <w:t>Filter ,</w:t>
+      </w:r>
+      <w:proofErr w:type="gramEnd"/>
+      <w:r>
+        <w:rPr>
+          <w:rFonts w:ascii="Garamond" w:hAnsi="Garamond" w:cs="Arial"/>
+          <w:i/>
+          <w:sz w:val="21"/>
+          <w:szCs w:val="21"/>
+        </w:rPr>
+        <w:t xml:space="preserve"> </w:t>
       </w:r>
       <w:r>
         <w:rPr>
@@ -3408,8 +3419,54 @@
           <w:sz w:val="21"/>
           <w:szCs w:val="21"/>
         </w:rPr>
-        <w:t xml:space="preserve"> among pedestrian, cyclist, and intelligent wheelchair</w:t>
-      </w:r>
+        <w:t xml:space="preserve"> among </w:t>
+      </w:r>
+      <w:proofErr w:type="gramStart"/>
+      <w:r>
+        <w:rPr>
+          <w:rFonts w:ascii="Garamond" w:hAnsi="Garamond" w:cs="Arial"/>
+          <w:sz w:val="21"/>
+          <w:szCs w:val="21"/>
+        </w:rPr>
+        <w:t>pedestrian</w:t>
+      </w:r>
+      <w:proofErr w:type="gramEnd"/>
+      <w:r>
+        <w:rPr>
+          <w:rFonts w:ascii="Garamond" w:hAnsi="Garamond" w:cs="Arial"/>
+          <w:sz w:val="21"/>
+          <w:szCs w:val="21"/>
+        </w:rPr>
+        <w:t xml:space="preserve">, </w:t>
+      </w:r>
+      <w:proofErr w:type="gramStart"/>
+      <w:r>
+        <w:rPr>
+          <w:rFonts w:ascii="Garamond" w:hAnsi="Garamond" w:cs="Arial"/>
+          <w:sz w:val="21"/>
+          <w:szCs w:val="21"/>
+        </w:rPr>
+        <w:t>cyclist</w:t>
+      </w:r>
+      <w:proofErr w:type="gramEnd"/>
+      <w:r>
+        <w:rPr>
+          <w:rFonts w:ascii="Garamond" w:hAnsi="Garamond" w:cs="Arial"/>
+          <w:sz w:val="21"/>
+          <w:szCs w:val="21"/>
+        </w:rPr>
+        <w:t xml:space="preserve">, and intelligent </w:t>
+      </w:r>
+      <w:proofErr w:type="gramStart"/>
+      <w:r>
+        <w:rPr>
+          <w:rFonts w:ascii="Garamond" w:hAnsi="Garamond" w:cs="Arial"/>
+          <w:sz w:val="21"/>
+          <w:szCs w:val="21"/>
+        </w:rPr>
+        <w:t>wheelchair</w:t>
+      </w:r>
+      <w:proofErr w:type="gramEnd"/>
     </w:p>
     <w:p>
       <w:pPr>
@@ -3470,7 +3527,16 @@
           <w:sz w:val="21"/>
           <w:szCs w:val="21"/>
         </w:rPr>
-        <w:t xml:space="preserve"> Extended Kalman Filter</w:t>
+        <w:t xml:space="preserve"> Extended Kalman </w:t>
+      </w:r>
+      <w:proofErr w:type="gramStart"/>
+      <w:r>
+        <w:rPr>
+          <w:rFonts w:ascii="Garamond" w:hAnsi="Garamond" w:cs="Arial"/>
+          <w:sz w:val="21"/>
+          <w:szCs w:val="21"/>
+        </w:rPr>
+        <w:t>Filter</w:t>
       </w:r>
       <w:r>
         <w:rPr>
@@ -3480,6 +3546,7 @@
         </w:rPr>
         <w:t>;</w:t>
       </w:r>
+      <w:proofErr w:type="gramEnd"/>
       <w:r>
         <w:rPr>
           <w:rFonts w:ascii="Garamond" w:hAnsi="Garamond" w:cs="Arial"/>

</xml_diff>

<commit_message>
Avride Robot Motion Planning - Software Engineer
</commit_message>
<xml_diff>
--- a/Marika_Nishi_Resume.docx
+++ b/Marika_Nishi_Resume.docx
@@ -43,7 +43,7 @@
           <w:sz w:val="18"/>
           <w:szCs w:val="8"/>
         </w:rPr>
-        <w:t>Mechatronics Engineer</w:t>
+        <w:t>Robot Motion Planning - Software Engineer</w:t>
       </w:r>
       <w:r>
         <w:rPr>
@@ -707,10 +707,29 @@
       <w:r>
         <w:rPr>
           <w:rFonts w:ascii="Garamond" w:hAnsi="Garamond" w:cs="Arial"/>
-          <w:sz w:val="21"/>
-          <w:szCs w:val="21"/>
-        </w:rPr>
-        <w:t xml:space="preserve">CAD, 3D Printing, Fabrication, </w:t>
+          <w:iCs/>
+          <w:sz w:val="21"/>
+          <w:szCs w:val="21"/>
+        </w:rPr>
+        <w:t>C++</w:t>
+      </w:r>
+      <w:r>
+        <w:rPr>
+          <w:rFonts w:ascii="Garamond" w:hAnsi="Garamond" w:cs="Arial"/>
+          <w:iCs/>
+          <w:sz w:val="21"/>
+          <w:szCs w:val="21"/>
+        </w:rPr>
+        <w:t>, ROS</w:t>
+      </w:r>
+      <w:r>
+        <w:rPr>
+          <w:rFonts w:ascii="Garamond" w:hAnsi="Garamond" w:cs="Arial"/>
+          <w:iCs/>
+          <w:sz w:val="21"/>
+          <w:szCs w:val="21"/>
+        </w:rPr>
+        <w:t xml:space="preserve">, </w:t>
       </w:r>
       <w:r>
         <w:rPr>
@@ -728,21 +747,63 @@
           <w:sz w:val="21"/>
           <w:szCs w:val="21"/>
         </w:rPr>
-        <w:t>C++</w:t>
-      </w:r>
-      <w:r>
-        <w:rPr>
-          <w:rFonts w:ascii="Garamond" w:hAnsi="Garamond" w:cs="Arial"/>
-          <w:iCs/>
-          <w:sz w:val="21"/>
-          <w:szCs w:val="21"/>
-        </w:rPr>
-        <w:t>, ROS</w:t>
-      </w:r>
-      <w:r>
-        <w:rPr>
-          <w:rFonts w:ascii="Garamond" w:hAnsi="Garamond" w:cs="Arial"/>
-          <w:iCs/>
+        <w:t xml:space="preserve">Pytorch, </w:t>
+      </w:r>
+      <w:r>
+        <w:rPr>
+          <w:rFonts w:ascii="Garamond" w:hAnsi="Garamond" w:cs="Arial"/>
+          <w:iCs/>
+          <w:sz w:val="21"/>
+          <w:szCs w:val="21"/>
+        </w:rPr>
+        <w:t>ML-based</w:t>
+      </w:r>
+      <w:r>
+        <w:rPr>
+          <w:rFonts w:ascii="Garamond" w:hAnsi="Garamond" w:cs="Arial"/>
+          <w:iCs/>
+          <w:sz w:val="21"/>
+          <w:szCs w:val="21"/>
+        </w:rPr>
+        <w:t xml:space="preserve"> Planning, </w:t>
+      </w:r>
+      <w:r>
+        <w:rPr>
+          <w:rFonts w:ascii="Garamond" w:hAnsi="Garamond" w:cs="Arial"/>
+          <w:iCs/>
+          <w:sz w:val="21"/>
+          <w:szCs w:val="21"/>
+        </w:rPr>
+        <w:t xml:space="preserve">Machine Learning, </w:t>
+      </w:r>
+      <w:r>
+        <w:rPr>
+          <w:rFonts w:ascii="Garamond" w:hAnsi="Garamond" w:cs="Arial"/>
+          <w:iCs/>
+          <w:sz w:val="21"/>
+          <w:szCs w:val="21"/>
+        </w:rPr>
+        <w:t xml:space="preserve">Control, </w:t>
+      </w:r>
+      <w:r>
+        <w:rPr>
+          <w:rFonts w:ascii="Garamond" w:hAnsi="Garamond" w:cs="Arial"/>
+          <w:sz w:val="21"/>
+          <w:szCs w:val="21"/>
+        </w:rPr>
+        <w:t>Simulator</w:t>
+      </w:r>
+      <w:r>
+        <w:rPr>
+          <w:rFonts w:ascii="Garamond" w:hAnsi="Garamond" w:cs="Arial"/>
+          <w:sz w:val="21"/>
+          <w:szCs w:val="21"/>
+        </w:rPr>
+        <w:t xml:space="preserve"> (Gazebo, MuJoCo)</w:t>
+      </w:r>
+      <w:r>
+        <w:rPr>
+          <w:rFonts w:ascii="Garamond" w:hAnsi="Garamond" w:cs="Arial"/>
           <w:sz w:val="21"/>
           <w:szCs w:val="21"/>
         </w:rPr>
@@ -751,15 +812,6 @@
       <w:r>
         <w:rPr>
           <w:rFonts w:ascii="Garamond" w:hAnsi="Garamond" w:cs="Arial"/>
-          <w:iCs/>
-          <w:sz w:val="21"/>
-          <w:szCs w:val="21"/>
-        </w:rPr>
-        <w:t xml:space="preserve">Pytorch, </w:t>
-      </w:r>
-      <w:r>
-        <w:rPr>
-          <w:rFonts w:ascii="Garamond" w:hAnsi="Garamond" w:cs="Arial"/>
           <w:sz w:val="21"/>
           <w:szCs w:val="21"/>
         </w:rPr>
@@ -771,19 +823,86 @@
           <w:sz w:val="21"/>
           <w:szCs w:val="21"/>
         </w:rPr>
-        <w:t>Simulator</w:t>
-      </w:r>
-      <w:r>
-        <w:rPr>
-          <w:rFonts w:ascii="Garamond" w:hAnsi="Garamond" w:cs="Arial"/>
-          <w:sz w:val="21"/>
-          <w:szCs w:val="21"/>
-        </w:rPr>
-        <w:t xml:space="preserve"> (Gazebo, MuJoCo)</w:t>
-      </w:r>
-      <w:r>
-        <w:rPr>
-          <w:rFonts w:ascii="Garamond" w:hAnsi="Garamond" w:cs="Arial"/>
+        <w:t xml:space="preserve">SLAM, </w:t>
+      </w:r>
+      <w:r>
+        <w:rPr>
+          <w:rFonts w:ascii="Garamond" w:hAnsi="Garamond" w:cs="Arial"/>
+          <w:sz w:val="21"/>
+          <w:szCs w:val="21"/>
+        </w:rPr>
+        <w:t>S</w:t>
+      </w:r>
+      <w:r>
+        <w:rPr>
+          <w:rFonts w:ascii="Garamond" w:hAnsi="Garamond" w:cs="Arial"/>
+          <w:sz w:val="21"/>
+          <w:szCs w:val="21"/>
+        </w:rPr>
+        <w:t xml:space="preserve">ensor </w:t>
+      </w:r>
+      <w:r>
+        <w:rPr>
+          <w:rFonts w:ascii="Garamond" w:hAnsi="Garamond" w:cs="Arial"/>
+          <w:sz w:val="21"/>
+          <w:szCs w:val="21"/>
+        </w:rPr>
+        <w:t>F</w:t>
+      </w:r>
+      <w:r>
+        <w:rPr>
+          <w:rFonts w:ascii="Garamond" w:hAnsi="Garamond" w:cs="Arial"/>
+          <w:sz w:val="21"/>
+          <w:szCs w:val="21"/>
+        </w:rPr>
+        <w:t xml:space="preserve">usion, </w:t>
+      </w:r>
+      <w:r>
+        <w:rPr>
+          <w:rFonts w:ascii="Garamond" w:hAnsi="Garamond" w:cs="Arial"/>
+          <w:sz w:val="21"/>
+          <w:szCs w:val="21"/>
+        </w:rPr>
+        <w:t xml:space="preserve">Object Detection, </w:t>
+      </w:r>
+      <w:r>
+        <w:rPr>
+          <w:rFonts w:ascii="Garamond" w:hAnsi="Garamond" w:cs="Arial"/>
+          <w:sz w:val="21"/>
+          <w:szCs w:val="21"/>
+        </w:rPr>
+        <w:t>Segmentation,</w:t>
+      </w:r>
+      <w:r>
+        <w:rPr>
+          <w:rFonts w:ascii="Garamond" w:hAnsi="Garamond" w:cs="Arial"/>
+          <w:sz w:val="21"/>
+          <w:szCs w:val="21"/>
+        </w:rPr>
+        <w:t xml:space="preserve"> </w:t>
+      </w:r>
+      <w:r>
+        <w:rPr>
+          <w:rFonts w:ascii="Garamond" w:hAnsi="Garamond" w:cs="Arial"/>
+          <w:iCs/>
+          <w:sz w:val="21"/>
+          <w:szCs w:val="21"/>
+        </w:rPr>
+        <w:t xml:space="preserve">Matlab, </w:t>
+      </w:r>
+      <w:r>
+        <w:rPr>
+          <w:rFonts w:ascii="Garamond" w:hAnsi="Garamond" w:cs="Arial"/>
+          <w:iCs/>
+          <w:sz w:val="21"/>
+          <w:szCs w:val="21"/>
+        </w:rPr>
+        <w:t>Autonomous driving</w:t>
+      </w:r>
+      <w:r>
+        <w:rPr>
+          <w:rFonts w:ascii="Garamond" w:hAnsi="Garamond" w:cs="Arial"/>
+          <w:iCs/>
           <w:sz w:val="21"/>
           <w:szCs w:val="21"/>
         </w:rPr>
@@ -792,80 +911,16 @@
       <w:r>
         <w:rPr>
           <w:rFonts w:ascii="Garamond" w:hAnsi="Garamond" w:cs="Arial"/>
-          <w:sz w:val="21"/>
-          <w:szCs w:val="21"/>
-        </w:rPr>
-        <w:t xml:space="preserve">SLAM, </w:t>
-      </w:r>
-      <w:r>
-        <w:rPr>
-          <w:rFonts w:ascii="Garamond" w:hAnsi="Garamond" w:cs="Arial"/>
-          <w:sz w:val="21"/>
-          <w:szCs w:val="21"/>
-        </w:rPr>
-        <w:t>S</w:t>
-      </w:r>
-      <w:r>
-        <w:rPr>
-          <w:rFonts w:ascii="Garamond" w:hAnsi="Garamond" w:cs="Arial"/>
-          <w:sz w:val="21"/>
-          <w:szCs w:val="21"/>
-        </w:rPr>
-        <w:t xml:space="preserve">ensor </w:t>
-      </w:r>
-      <w:r>
-        <w:rPr>
-          <w:rFonts w:ascii="Garamond" w:hAnsi="Garamond" w:cs="Arial"/>
-          <w:sz w:val="21"/>
-          <w:szCs w:val="21"/>
-        </w:rPr>
-        <w:t>F</w:t>
-      </w:r>
-      <w:r>
-        <w:rPr>
-          <w:rFonts w:ascii="Garamond" w:hAnsi="Garamond" w:cs="Arial"/>
-          <w:sz w:val="21"/>
-          <w:szCs w:val="21"/>
-        </w:rPr>
-        <w:t xml:space="preserve">usion, </w:t>
-      </w:r>
-      <w:r>
-        <w:rPr>
-          <w:rFonts w:ascii="Garamond" w:hAnsi="Garamond" w:cs="Arial"/>
-          <w:iCs/>
-          <w:sz w:val="21"/>
-          <w:szCs w:val="21"/>
-        </w:rPr>
-        <w:t xml:space="preserve">Git, </w:t>
-      </w:r>
-      <w:r>
-        <w:rPr>
-          <w:rFonts w:ascii="Garamond" w:hAnsi="Garamond" w:cs="Arial"/>
-          <w:iCs/>
-          <w:sz w:val="21"/>
-          <w:szCs w:val="21"/>
-        </w:rPr>
-        <w:t xml:space="preserve">Machine Learning, </w:t>
-      </w:r>
-      <w:r>
-        <w:rPr>
-          <w:rFonts w:ascii="Garamond" w:hAnsi="Garamond" w:cs="Arial"/>
-          <w:sz w:val="21"/>
-          <w:szCs w:val="21"/>
-        </w:rPr>
-        <w:t xml:space="preserve">Object Detection, </w:t>
-      </w:r>
-      <w:r>
-        <w:rPr>
-          <w:rFonts w:ascii="Garamond" w:hAnsi="Garamond" w:cs="Arial"/>
-          <w:sz w:val="21"/>
-          <w:szCs w:val="21"/>
-        </w:rPr>
-        <w:t>Segmentation,</w:t>
-      </w:r>
-      <w:r>
-        <w:rPr>
-          <w:rFonts w:ascii="Garamond" w:hAnsi="Garamond" w:cs="Arial"/>
+          <w:iCs/>
+          <w:sz w:val="21"/>
+          <w:szCs w:val="21"/>
+        </w:rPr>
+        <w:t>Linux,</w:t>
+      </w:r>
+      <w:r>
+        <w:rPr>
+          <w:rFonts w:ascii="Garamond" w:hAnsi="Garamond" w:cs="Arial"/>
+          <w:iCs/>
           <w:sz w:val="21"/>
           <w:szCs w:val="21"/>
         </w:rPr>
@@ -878,16 +933,25 @@
           <w:sz w:val="21"/>
           <w:szCs w:val="21"/>
         </w:rPr>
-        <w:t xml:space="preserve">Matlab, </w:t>
-      </w:r>
-      <w:r>
-        <w:rPr>
-          <w:rFonts w:ascii="Garamond" w:hAnsi="Garamond" w:cs="Arial"/>
-          <w:iCs/>
-          <w:sz w:val="21"/>
-          <w:szCs w:val="21"/>
-        </w:rPr>
-        <w:t>Autonomous driving, ADAS</w:t>
+        <w:t>Git,</w:t>
+      </w:r>
+      <w:r>
+        <w:rPr>
+          <w:rFonts w:ascii="Garamond" w:hAnsi="Garamond" w:cs="Arial"/>
+          <w:iCs/>
+          <w:sz w:val="21"/>
+          <w:szCs w:val="21"/>
+        </w:rPr>
+        <w:t xml:space="preserve"> </w:t>
+      </w:r>
+      <w:r>
+        <w:rPr>
+          <w:rFonts w:ascii="Garamond" w:hAnsi="Garamond" w:cs="Arial"/>
+          <w:iCs/>
+          <w:sz w:val="21"/>
+          <w:szCs w:val="21"/>
+        </w:rPr>
+        <w:t>Docker</w:t>
       </w:r>
       <w:r>
         <w:rPr>
@@ -901,20 +965,10 @@
       <w:r>
         <w:rPr>
           <w:rFonts w:ascii="Garamond" w:hAnsi="Garamond" w:cs="Arial"/>
-          <w:iCs/>
-          <w:sz w:val="21"/>
-          <w:szCs w:val="21"/>
-        </w:rPr>
-        <w:t xml:space="preserve">Linux, </w:t>
-      </w:r>
-      <w:r>
-        <w:rPr>
-          <w:rFonts w:ascii="Garamond" w:hAnsi="Garamond" w:cs="Arial"/>
-          <w:iCs/>
-          <w:sz w:val="21"/>
-          <w:szCs w:val="21"/>
-        </w:rPr>
-        <w:t>Docker</w:t>
+          <w:sz w:val="21"/>
+          <w:szCs w:val="21"/>
+        </w:rPr>
+        <w:t>CAD</w:t>
       </w:r>
     </w:p>
     <w:p>
@@ -1043,7 +1097,6 @@
         </w:rPr>
         <w:t xml:space="preserve"> and </w:t>
       </w:r>
-      <w:proofErr w:type="gramStart"/>
       <w:r>
         <w:rPr>
           <w:rFonts w:ascii="Garamond" w:hAnsi="Garamond" w:cs="Arial"/>
@@ -1058,16 +1111,7 @@
           <w:sz w:val="21"/>
           <w:szCs w:val="21"/>
         </w:rPr>
-        <w:t>evelopment</w:t>
-      </w:r>
-      <w:proofErr w:type="gramEnd"/>
-      <w:r>
-        <w:rPr>
-          <w:rFonts w:ascii="Garamond" w:hAnsi="Garamond" w:cs="Arial"/>
-          <w:sz w:val="21"/>
-          <w:szCs w:val="21"/>
-        </w:rPr>
-        <w:t>,</w:t>
+        <w:t>evelopment,</w:t>
       </w:r>
       <w:r>
         <w:rPr>
@@ -2151,7 +2195,6 @@
         </w:rPr>
         <w:t xml:space="preserve">Designed and built </w:t>
       </w:r>
-      <w:proofErr w:type="gramStart"/>
       <w:r>
         <w:rPr>
           <w:rFonts w:ascii="Garamond" w:hAnsi="Garamond" w:cs="Arial"/>
@@ -2160,7 +2203,6 @@
         </w:rPr>
         <w:t>map</w:t>
       </w:r>
-      <w:proofErr w:type="gramEnd"/>
       <w:r>
         <w:rPr>
           <w:rFonts w:ascii="Garamond" w:hAnsi="Garamond" w:cs="Arial"/>
@@ -2337,33 +2379,15 @@
           <w:sz w:val="21"/>
           <w:szCs w:val="21"/>
         </w:rPr>
-        <w:t xml:space="preserve"> by fixing CAN signal </w:t>
-      </w:r>
-      <w:proofErr w:type="gramStart"/>
-      <w:r>
-        <w:rPr>
-          <w:rFonts w:ascii="Garamond" w:hAnsi="Garamond" w:cs="Arial"/>
-          <w:sz w:val="21"/>
-          <w:szCs w:val="21"/>
-        </w:rPr>
-        <w:t>decoding</w:t>
-      </w:r>
-      <w:r>
-        <w:rPr>
-          <w:rFonts w:ascii="Garamond" w:hAnsi="Garamond" w:cs="Arial"/>
-          <w:sz w:val="21"/>
-          <w:szCs w:val="21"/>
-        </w:rPr>
-        <w:t>;</w:t>
-      </w:r>
-      <w:proofErr w:type="gramEnd"/>
-      <w:r>
-        <w:rPr>
-          <w:rFonts w:ascii="Garamond" w:hAnsi="Garamond" w:cs="Arial"/>
-          <w:sz w:val="21"/>
-          <w:szCs w:val="21"/>
-        </w:rPr>
-        <w:t xml:space="preserve"> </w:t>
+        <w:t xml:space="preserve"> by fixing CAN signal decoding</w:t>
+      </w:r>
+      <w:r>
+        <w:rPr>
+          <w:rFonts w:ascii="Garamond" w:hAnsi="Garamond" w:cs="Arial"/>
+          <w:sz w:val="21"/>
+          <w:szCs w:val="21"/>
+        </w:rPr>
+        <w:t xml:space="preserve">; </w:t>
       </w:r>
       <w:r>
         <w:rPr>
@@ -3252,27 +3276,7 @@
           <w:sz w:val="21"/>
           <w:szCs w:val="21"/>
         </w:rPr>
-        <w:t xml:space="preserve">Extended Kalman </w:t>
-      </w:r>
-      <w:proofErr w:type="gramStart"/>
-      <w:r>
-        <w:rPr>
-          <w:rFonts w:ascii="Garamond" w:hAnsi="Garamond" w:cs="Arial"/>
-          <w:i/>
-          <w:sz w:val="21"/>
-          <w:szCs w:val="21"/>
-        </w:rPr>
-        <w:t>Filter ,</w:t>
-      </w:r>
-      <w:proofErr w:type="gramEnd"/>
-      <w:r>
-        <w:rPr>
-          <w:rFonts w:ascii="Garamond" w:hAnsi="Garamond" w:cs="Arial"/>
-          <w:i/>
-          <w:sz w:val="21"/>
-          <w:szCs w:val="21"/>
-        </w:rPr>
-        <w:t xml:space="preserve"> </w:t>
+        <w:t xml:space="preserve">Extended Kalman Filter , </w:t>
       </w:r>
       <w:r>
         <w:rPr>
@@ -3419,54 +3423,8 @@
           <w:sz w:val="21"/>
           <w:szCs w:val="21"/>
         </w:rPr>
-        <w:t xml:space="preserve"> among </w:t>
-      </w:r>
-      <w:proofErr w:type="gramStart"/>
-      <w:r>
-        <w:rPr>
-          <w:rFonts w:ascii="Garamond" w:hAnsi="Garamond" w:cs="Arial"/>
-          <w:sz w:val="21"/>
-          <w:szCs w:val="21"/>
-        </w:rPr>
-        <w:t>pedestrian</w:t>
-      </w:r>
-      <w:proofErr w:type="gramEnd"/>
-      <w:r>
-        <w:rPr>
-          <w:rFonts w:ascii="Garamond" w:hAnsi="Garamond" w:cs="Arial"/>
-          <w:sz w:val="21"/>
-          <w:szCs w:val="21"/>
-        </w:rPr>
-        <w:t xml:space="preserve">, </w:t>
-      </w:r>
-      <w:proofErr w:type="gramStart"/>
-      <w:r>
-        <w:rPr>
-          <w:rFonts w:ascii="Garamond" w:hAnsi="Garamond" w:cs="Arial"/>
-          <w:sz w:val="21"/>
-          <w:szCs w:val="21"/>
-        </w:rPr>
-        <w:t>cyclist</w:t>
-      </w:r>
-      <w:proofErr w:type="gramEnd"/>
-      <w:r>
-        <w:rPr>
-          <w:rFonts w:ascii="Garamond" w:hAnsi="Garamond" w:cs="Arial"/>
-          <w:sz w:val="21"/>
-          <w:szCs w:val="21"/>
-        </w:rPr>
-        <w:t xml:space="preserve">, and intelligent </w:t>
-      </w:r>
-      <w:proofErr w:type="gramStart"/>
-      <w:r>
-        <w:rPr>
-          <w:rFonts w:ascii="Garamond" w:hAnsi="Garamond" w:cs="Arial"/>
-          <w:sz w:val="21"/>
-          <w:szCs w:val="21"/>
-        </w:rPr>
-        <w:t>wheelchair</w:t>
-      </w:r>
-      <w:proofErr w:type="gramEnd"/>
+        <w:t xml:space="preserve"> among pedestrian, cyclist, and intelligent wheelchair</w:t>
+      </w:r>
     </w:p>
     <w:p>
       <w:pPr>
@@ -3527,16 +3485,7 @@
           <w:sz w:val="21"/>
           <w:szCs w:val="21"/>
         </w:rPr>
-        <w:t xml:space="preserve"> Extended Kalman </w:t>
-      </w:r>
-      <w:proofErr w:type="gramStart"/>
-      <w:r>
-        <w:rPr>
-          <w:rFonts w:ascii="Garamond" w:hAnsi="Garamond" w:cs="Arial"/>
-          <w:sz w:val="21"/>
-          <w:szCs w:val="21"/>
-        </w:rPr>
-        <w:t>Filter</w:t>
+        <w:t xml:space="preserve"> Extended Kalman Filter</w:t>
       </w:r>
       <w:r>
         <w:rPr>
@@ -3546,7 +3495,6 @@
         </w:rPr>
         <w:t>;</w:t>
       </w:r>
-      <w:proofErr w:type="gramEnd"/>
       <w:r>
         <w:rPr>
           <w:rFonts w:ascii="Garamond" w:hAnsi="Garamond" w:cs="Arial"/>

</xml_diff>

<commit_message>
Cosmic Robotics Robotics Engineering Intern
</commit_message>
<xml_diff>
--- a/Marika_Nishi_Resume.docx
+++ b/Marika_Nishi_Resume.docx
@@ -43,7 +43,7 @@
           <w:sz w:val="18"/>
           <w:szCs w:val="8"/>
         </w:rPr>
-        <w:t>Robot Motion Planning - Software Engineer</w:t>
+        <w:t>Robotics Engineering Intern</w:t>
       </w:r>
       <w:r>
         <w:rPr>
@@ -299,7 +299,18 @@
           <w:sz w:val="21"/>
           <w:szCs w:val="21"/>
         </w:rPr>
-        <w:t>26</w:t>
+        <w:t>2</w:t>
+      </w:r>
+      <w:r>
+        <w:rPr>
+          <w:rFonts w:ascii="Garamond" w:hAnsi="Garamond" w:cs="Arial"/>
+          <w:bCs/>
+          <w:i/>
+          <w:iCs/>
+          <w:sz w:val="21"/>
+          <w:szCs w:val="21"/>
+        </w:rPr>
+        <w:t>7</w:t>
       </w:r>
     </w:p>
     <w:p>
@@ -336,6 +347,16 @@
       <w:r>
         <w:rPr>
           <w:rFonts w:ascii="Garamond" w:hAnsi="Garamond" w:cs="Arial"/>
+          <w:i/>
+          <w:iCs/>
+          <w:sz w:val="21"/>
+          <w:szCs w:val="21"/>
+        </w:rPr>
+        <w:t>, Computer Science</w:t>
+      </w:r>
+      <w:r>
+        <w:rPr>
+          <w:rFonts w:ascii="Garamond" w:hAnsi="Garamond" w:cs="Arial"/>
           <w:sz w:val="21"/>
           <w:szCs w:val="21"/>
         </w:rPr>
@@ -349,7 +370,7 @@
           <w:sz w:val="21"/>
           <w:szCs w:val="21"/>
         </w:rPr>
-        <w:t xml:space="preserve">Concentrations: Computer Vision, Autonomous </w:t>
+        <w:t xml:space="preserve">Concentrations: Autonomous </w:t>
       </w:r>
       <w:r>
         <w:rPr>
@@ -720,15 +741,6 @@
           <w:sz w:val="21"/>
           <w:szCs w:val="21"/>
         </w:rPr>
-        <w:t>, ROS</w:t>
-      </w:r>
-      <w:r>
-        <w:rPr>
-          <w:rFonts w:ascii="Garamond" w:hAnsi="Garamond" w:cs="Arial"/>
-          <w:iCs/>
-          <w:sz w:val="21"/>
-          <w:szCs w:val="21"/>
-        </w:rPr>
         <w:t xml:space="preserve">, </w:t>
       </w:r>
       <w:r>
@@ -747,6 +759,24 @@
           <w:sz w:val="21"/>
           <w:szCs w:val="21"/>
         </w:rPr>
+        <w:t xml:space="preserve">Linux, </w:t>
+      </w:r>
+      <w:r>
+        <w:rPr>
+          <w:rFonts w:ascii="Garamond" w:hAnsi="Garamond" w:cs="Arial"/>
+          <w:iCs/>
+          <w:sz w:val="21"/>
+          <w:szCs w:val="21"/>
+        </w:rPr>
+        <w:t xml:space="preserve">ROS, </w:t>
+      </w:r>
+      <w:r>
+        <w:rPr>
+          <w:rFonts w:ascii="Garamond" w:hAnsi="Garamond" w:cs="Arial"/>
+          <w:iCs/>
+          <w:sz w:val="21"/>
+          <w:szCs w:val="21"/>
+        </w:rPr>
         <w:t xml:space="preserve">Pytorch, </w:t>
       </w:r>
       <w:r>
@@ -779,6 +809,30 @@
       <w:r>
         <w:rPr>
           <w:rFonts w:ascii="Garamond" w:hAnsi="Garamond" w:cs="Arial"/>
+          <w:sz w:val="21"/>
+          <w:szCs w:val="21"/>
+        </w:rPr>
+        <w:t>Simulator</w:t>
+      </w:r>
+      <w:r>
+        <w:rPr>
+          <w:rFonts w:ascii="Garamond" w:hAnsi="Garamond" w:cs="Arial"/>
+          <w:sz w:val="21"/>
+          <w:szCs w:val="21"/>
+        </w:rPr>
+        <w:t xml:space="preserve"> (Gazebo, MuJoCo)</w:t>
+      </w:r>
+      <w:r>
+        <w:rPr>
+          <w:rFonts w:ascii="Garamond" w:hAnsi="Garamond" w:cs="Arial"/>
+          <w:sz w:val="21"/>
+          <w:szCs w:val="21"/>
+        </w:rPr>
+        <w:t xml:space="preserve">, </w:t>
+      </w:r>
+      <w:r>
+        <w:rPr>
+          <w:rFonts w:ascii="Garamond" w:hAnsi="Garamond" w:cs="Arial"/>
           <w:iCs/>
           <w:sz w:val="21"/>
           <w:szCs w:val="21"/>
@@ -791,19 +845,94 @@
           <w:sz w:val="21"/>
           <w:szCs w:val="21"/>
         </w:rPr>
-        <w:t>Simulator</w:t>
-      </w:r>
-      <w:r>
-        <w:rPr>
-          <w:rFonts w:ascii="Garamond" w:hAnsi="Garamond" w:cs="Arial"/>
-          <w:sz w:val="21"/>
-          <w:szCs w:val="21"/>
-        </w:rPr>
-        <w:t xml:space="preserve"> (Gazebo, MuJoCo)</w:t>
-      </w:r>
-      <w:r>
-        <w:rPr>
-          <w:rFonts w:ascii="Garamond" w:hAnsi="Garamond" w:cs="Arial"/>
+        <w:t xml:space="preserve">OpenCV, </w:t>
+      </w:r>
+      <w:r>
+        <w:rPr>
+          <w:rFonts w:ascii="Garamond" w:hAnsi="Garamond" w:cs="Arial"/>
+          <w:sz w:val="21"/>
+          <w:szCs w:val="21"/>
+        </w:rPr>
+        <w:t xml:space="preserve">SLAM, </w:t>
+      </w:r>
+      <w:r>
+        <w:rPr>
+          <w:rFonts w:ascii="Garamond" w:hAnsi="Garamond" w:cs="Arial"/>
+          <w:sz w:val="21"/>
+          <w:szCs w:val="21"/>
+        </w:rPr>
+        <w:t>S</w:t>
+      </w:r>
+      <w:r>
+        <w:rPr>
+          <w:rFonts w:ascii="Garamond" w:hAnsi="Garamond" w:cs="Arial"/>
+          <w:sz w:val="21"/>
+          <w:szCs w:val="21"/>
+        </w:rPr>
+        <w:t xml:space="preserve">ensor </w:t>
+      </w:r>
+      <w:r>
+        <w:rPr>
+          <w:rFonts w:ascii="Garamond" w:hAnsi="Garamond" w:cs="Arial"/>
+          <w:sz w:val="21"/>
+          <w:szCs w:val="21"/>
+        </w:rPr>
+        <w:t>F</w:t>
+      </w:r>
+      <w:r>
+        <w:rPr>
+          <w:rFonts w:ascii="Garamond" w:hAnsi="Garamond" w:cs="Arial"/>
+          <w:sz w:val="21"/>
+          <w:szCs w:val="21"/>
+        </w:rPr>
+        <w:t xml:space="preserve">usion, </w:t>
+      </w:r>
+      <w:r>
+        <w:rPr>
+          <w:rFonts w:ascii="Garamond" w:hAnsi="Garamond" w:cs="Arial"/>
+          <w:sz w:val="21"/>
+          <w:szCs w:val="21"/>
+        </w:rPr>
+        <w:t xml:space="preserve">Object Detection, </w:t>
+      </w:r>
+      <w:r>
+        <w:rPr>
+          <w:rFonts w:ascii="Garamond" w:hAnsi="Garamond" w:cs="Arial"/>
+          <w:sz w:val="21"/>
+          <w:szCs w:val="21"/>
+        </w:rPr>
+        <w:t>Segmentation,</w:t>
+      </w:r>
+      <w:r>
+        <w:rPr>
+          <w:rFonts w:ascii="Garamond" w:hAnsi="Garamond" w:cs="Arial"/>
+          <w:sz w:val="21"/>
+          <w:szCs w:val="21"/>
+        </w:rPr>
+        <w:t xml:space="preserve"> </w:t>
+      </w:r>
+      <w:r>
+        <w:rPr>
+          <w:rFonts w:ascii="Garamond" w:hAnsi="Garamond" w:cs="Arial"/>
+          <w:iCs/>
+          <w:sz w:val="21"/>
+          <w:szCs w:val="21"/>
+        </w:rPr>
+        <w:t xml:space="preserve">Matlab, </w:t>
+      </w:r>
+      <w:r>
+        <w:rPr>
+          <w:rFonts w:ascii="Garamond" w:hAnsi="Garamond" w:cs="Arial"/>
+          <w:iCs/>
+          <w:sz w:val="21"/>
+          <w:szCs w:val="21"/>
+        </w:rPr>
+        <w:t>Autonomous driving</w:t>
+      </w:r>
+      <w:r>
+        <w:rPr>
+          <w:rFonts w:ascii="Garamond" w:hAnsi="Garamond" w:cs="Arial"/>
+          <w:iCs/>
           <w:sz w:val="21"/>
           <w:szCs w:val="21"/>
         </w:rPr>
@@ -812,70 +941,16 @@
       <w:r>
         <w:rPr>
           <w:rFonts w:ascii="Garamond" w:hAnsi="Garamond" w:cs="Arial"/>
-          <w:sz w:val="21"/>
-          <w:szCs w:val="21"/>
-        </w:rPr>
-        <w:t xml:space="preserve">OpenCV, </w:t>
-      </w:r>
-      <w:r>
-        <w:rPr>
-          <w:rFonts w:ascii="Garamond" w:hAnsi="Garamond" w:cs="Arial"/>
-          <w:sz w:val="21"/>
-          <w:szCs w:val="21"/>
-        </w:rPr>
-        <w:t xml:space="preserve">SLAM, </w:t>
-      </w:r>
-      <w:r>
-        <w:rPr>
-          <w:rFonts w:ascii="Garamond" w:hAnsi="Garamond" w:cs="Arial"/>
-          <w:sz w:val="21"/>
-          <w:szCs w:val="21"/>
-        </w:rPr>
-        <w:t>S</w:t>
-      </w:r>
-      <w:r>
-        <w:rPr>
-          <w:rFonts w:ascii="Garamond" w:hAnsi="Garamond" w:cs="Arial"/>
-          <w:sz w:val="21"/>
-          <w:szCs w:val="21"/>
-        </w:rPr>
-        <w:t xml:space="preserve">ensor </w:t>
-      </w:r>
-      <w:r>
-        <w:rPr>
-          <w:rFonts w:ascii="Garamond" w:hAnsi="Garamond" w:cs="Arial"/>
-          <w:sz w:val="21"/>
-          <w:szCs w:val="21"/>
-        </w:rPr>
-        <w:t>F</w:t>
-      </w:r>
-      <w:r>
-        <w:rPr>
-          <w:rFonts w:ascii="Garamond" w:hAnsi="Garamond" w:cs="Arial"/>
-          <w:sz w:val="21"/>
-          <w:szCs w:val="21"/>
-        </w:rPr>
-        <w:t xml:space="preserve">usion, </w:t>
-      </w:r>
-      <w:r>
-        <w:rPr>
-          <w:rFonts w:ascii="Garamond" w:hAnsi="Garamond" w:cs="Arial"/>
-          <w:sz w:val="21"/>
-          <w:szCs w:val="21"/>
-        </w:rPr>
-        <w:t xml:space="preserve">Object Detection, </w:t>
-      </w:r>
-      <w:r>
-        <w:rPr>
-          <w:rFonts w:ascii="Garamond" w:hAnsi="Garamond" w:cs="Arial"/>
-          <w:sz w:val="21"/>
-          <w:szCs w:val="21"/>
-        </w:rPr>
-        <w:t>Segmentation,</w:t>
-      </w:r>
-      <w:r>
-        <w:rPr>
-          <w:rFonts w:ascii="Garamond" w:hAnsi="Garamond" w:cs="Arial"/>
+          <w:iCs/>
+          <w:sz w:val="21"/>
+          <w:szCs w:val="21"/>
+        </w:rPr>
+        <w:t>Git,</w:t>
+      </w:r>
+      <w:r>
+        <w:rPr>
+          <w:rFonts w:ascii="Garamond" w:hAnsi="Garamond" w:cs="Arial"/>
+          <w:iCs/>
           <w:sz w:val="21"/>
           <w:szCs w:val="21"/>
         </w:rPr>
@@ -888,87 +963,7 @@
           <w:sz w:val="21"/>
           <w:szCs w:val="21"/>
         </w:rPr>
-        <w:t xml:space="preserve">Matlab, </w:t>
-      </w:r>
-      <w:r>
-        <w:rPr>
-          <w:rFonts w:ascii="Garamond" w:hAnsi="Garamond" w:cs="Arial"/>
-          <w:iCs/>
-          <w:sz w:val="21"/>
-          <w:szCs w:val="21"/>
-        </w:rPr>
-        <w:t>Autonomous driving</w:t>
-      </w:r>
-      <w:r>
-        <w:rPr>
-          <w:rFonts w:ascii="Garamond" w:hAnsi="Garamond" w:cs="Arial"/>
-          <w:iCs/>
-          <w:sz w:val="21"/>
-          <w:szCs w:val="21"/>
-        </w:rPr>
-        <w:t xml:space="preserve">, </w:t>
-      </w:r>
-      <w:r>
-        <w:rPr>
-          <w:rFonts w:ascii="Garamond" w:hAnsi="Garamond" w:cs="Arial"/>
-          <w:iCs/>
-          <w:sz w:val="21"/>
-          <w:szCs w:val="21"/>
-        </w:rPr>
-        <w:t>Linux,</w:t>
-      </w:r>
-      <w:r>
-        <w:rPr>
-          <w:rFonts w:ascii="Garamond" w:hAnsi="Garamond" w:cs="Arial"/>
-          <w:iCs/>
-          <w:sz w:val="21"/>
-          <w:szCs w:val="21"/>
-        </w:rPr>
-        <w:t xml:space="preserve"> </w:t>
-      </w:r>
-      <w:r>
-        <w:rPr>
-          <w:rFonts w:ascii="Garamond" w:hAnsi="Garamond" w:cs="Arial"/>
-          <w:iCs/>
-          <w:sz w:val="21"/>
-          <w:szCs w:val="21"/>
-        </w:rPr>
-        <w:t>Git,</w:t>
-      </w:r>
-      <w:r>
-        <w:rPr>
-          <w:rFonts w:ascii="Garamond" w:hAnsi="Garamond" w:cs="Arial"/>
-          <w:iCs/>
-          <w:sz w:val="21"/>
-          <w:szCs w:val="21"/>
-        </w:rPr>
-        <w:t xml:space="preserve"> </w:t>
-      </w:r>
-      <w:r>
-        <w:rPr>
-          <w:rFonts w:ascii="Garamond" w:hAnsi="Garamond" w:cs="Arial"/>
-          <w:iCs/>
-          <w:sz w:val="21"/>
-          <w:szCs w:val="21"/>
-        </w:rPr>
         <w:t>Docker</w:t>
-      </w:r>
-      <w:r>
-        <w:rPr>
-          <w:rFonts w:ascii="Garamond" w:hAnsi="Garamond" w:cs="Arial"/>
-          <w:iCs/>
-          <w:sz w:val="21"/>
-          <w:szCs w:val="21"/>
-        </w:rPr>
-        <w:t xml:space="preserve">, </w:t>
-      </w:r>
-      <w:r>
-        <w:rPr>
-          <w:rFonts w:ascii="Garamond" w:hAnsi="Garamond" w:cs="Arial"/>
-          <w:sz w:val="21"/>
-          <w:szCs w:val="21"/>
-        </w:rPr>
-        <w:t>CAD</w:t>
       </w:r>
     </w:p>
     <w:p>
@@ -999,6 +994,62 @@
           <w:sz w:val="21"/>
           <w:szCs w:val="21"/>
         </w:rPr>
+        <w:t>CAD,</w:t>
+      </w:r>
+      <w:r>
+        <w:rPr>
+          <w:rFonts w:ascii="Garamond" w:hAnsi="Garamond" w:cs="Arial"/>
+          <w:sz w:val="21"/>
+          <w:szCs w:val="21"/>
+        </w:rPr>
+        <w:t xml:space="preserve"> </w:t>
+      </w:r>
+      <w:r>
+        <w:rPr>
+          <w:rFonts w:ascii="Garamond" w:hAnsi="Garamond" w:cs="Arial"/>
+          <w:sz w:val="21"/>
+          <w:szCs w:val="21"/>
+        </w:rPr>
+        <w:t>m</w:t>
+      </w:r>
+      <w:r>
+        <w:rPr>
+          <w:rFonts w:ascii="Garamond" w:hAnsi="Garamond" w:cs="Arial"/>
+          <w:sz w:val="21"/>
+          <w:szCs w:val="21"/>
+        </w:rPr>
+        <w:t xml:space="preserve">echanical </w:t>
+      </w:r>
+      <w:r>
+        <w:rPr>
+          <w:rFonts w:ascii="Garamond" w:hAnsi="Garamond" w:cs="Arial"/>
+          <w:sz w:val="21"/>
+          <w:szCs w:val="21"/>
+        </w:rPr>
+        <w:t>d</w:t>
+      </w:r>
+      <w:r>
+        <w:rPr>
+          <w:rFonts w:ascii="Garamond" w:hAnsi="Garamond" w:cs="Arial"/>
+          <w:sz w:val="21"/>
+          <w:szCs w:val="21"/>
+        </w:rPr>
+        <w:t xml:space="preserve">esign, </w:t>
+      </w:r>
+      <w:r>
+        <w:rPr>
+          <w:rFonts w:ascii="Garamond" w:hAnsi="Garamond" w:cs="Arial"/>
+          <w:sz w:val="21"/>
+          <w:szCs w:val="21"/>
+        </w:rPr>
+        <w:t xml:space="preserve">test and measurement, </w:t>
+      </w:r>
+      <w:r>
+        <w:rPr>
+          <w:rFonts w:ascii="Garamond" w:hAnsi="Garamond" w:cs="Arial"/>
+          <w:sz w:val="21"/>
+          <w:szCs w:val="21"/>
+        </w:rPr>
         <w:t>LiDAR</w:t>
       </w:r>
       <w:r>
@@ -1007,23 +1058,23 @@
           <w:sz w:val="21"/>
           <w:szCs w:val="21"/>
         </w:rPr>
-        <w:t xml:space="preserve">, </w:t>
-      </w:r>
-      <w:r>
-        <w:rPr>
-          <w:rFonts w:ascii="Garamond" w:hAnsi="Garamond" w:cs="Arial"/>
-          <w:sz w:val="21"/>
-          <w:szCs w:val="21"/>
-        </w:rPr>
-        <w:t xml:space="preserve">depth camera, </w:t>
-      </w:r>
-      <w:r>
-        <w:rPr>
-          <w:rFonts w:ascii="Garamond" w:hAnsi="Garamond" w:cs="Arial"/>
-          <w:sz w:val="21"/>
-          <w:szCs w:val="21"/>
-        </w:rPr>
-        <w:t>RGB camera, GPS</w:t>
+        <w:t>, RGB</w:t>
+      </w:r>
+      <w:r>
+        <w:rPr>
+          <w:rFonts w:ascii="Garamond" w:hAnsi="Garamond" w:cs="Arial"/>
+          <w:sz w:val="21"/>
+          <w:szCs w:val="21"/>
+        </w:rPr>
+        <w:t>D</w:t>
+      </w:r>
+      <w:r>
+        <w:rPr>
+          <w:rFonts w:ascii="Garamond" w:hAnsi="Garamond" w:cs="Arial"/>
+          <w:sz w:val="21"/>
+          <w:szCs w:val="21"/>
+        </w:rPr>
+        <w:t xml:space="preserve"> camera, GPS</w:t>
       </w:r>
       <w:r>
         <w:rPr>
@@ -1199,7 +1250,95 @@
           <w:sz w:val="21"/>
           <w:szCs w:val="21"/>
         </w:rPr>
-        <w:t>Mechatronics; Automotive Engineering;</w:t>
+        <w:t xml:space="preserve">Mechatronics; Automotive Engineering; </w:t>
+      </w:r>
+      <w:r>
+        <w:rPr>
+          <w:rFonts w:ascii="Garamond" w:hAnsi="Garamond" w:cs="Arial"/>
+          <w:sz w:val="21"/>
+          <w:szCs w:val="21"/>
+        </w:rPr>
+        <w:t>F1</w:t>
+      </w:r>
+      <w:r>
+        <w:rPr>
+          <w:rFonts w:ascii="Garamond" w:hAnsi="Garamond" w:cs="Arial"/>
+          <w:sz w:val="21"/>
+          <w:szCs w:val="21"/>
+        </w:rPr>
+        <w:t xml:space="preserve">tenth </w:t>
+      </w:r>
+      <w:r>
+        <w:rPr>
+          <w:rFonts w:ascii="Garamond" w:hAnsi="Garamond" w:cs="Arial"/>
+          <w:sz w:val="21"/>
+          <w:szCs w:val="21"/>
+        </w:rPr>
+        <w:t>Autonomous Racing Cars</w:t>
+      </w:r>
+      <w:r>
+        <w:rPr>
+          <w:rFonts w:ascii="Garamond" w:hAnsi="Garamond" w:cs="Arial"/>
+          <w:sz w:val="21"/>
+          <w:szCs w:val="21"/>
+        </w:rPr>
+        <w:t xml:space="preserve">; </w:t>
+      </w:r>
+      <w:r>
+        <w:rPr>
+          <w:rFonts w:ascii="Garamond" w:hAnsi="Garamond" w:cs="Arial"/>
+          <w:sz w:val="21"/>
+          <w:szCs w:val="21"/>
+        </w:rPr>
+        <w:t>Machine Perception</w:t>
+      </w:r>
+      <w:r>
+        <w:rPr>
+          <w:rFonts w:ascii="Garamond" w:hAnsi="Garamond" w:cs="Arial"/>
+          <w:sz w:val="21"/>
+          <w:szCs w:val="21"/>
+        </w:rPr>
+        <w:t xml:space="preserve">; </w:t>
+      </w:r>
+      <w:r>
+        <w:rPr>
+          <w:rFonts w:ascii="Garamond" w:hAnsi="Garamond" w:cs="Arial"/>
+          <w:sz w:val="21"/>
+          <w:szCs w:val="21"/>
+        </w:rPr>
+        <w:t>Computer Vision</w:t>
+      </w:r>
+      <w:r>
+        <w:rPr>
+          <w:rFonts w:ascii="Garamond" w:hAnsi="Garamond" w:cs="Arial"/>
+          <w:sz w:val="21"/>
+          <w:szCs w:val="21"/>
+        </w:rPr>
+        <w:t xml:space="preserve">; Machine Learning; </w:t>
+      </w:r>
+      <w:r>
+        <w:rPr>
+          <w:rFonts w:ascii="Garamond" w:hAnsi="Garamond" w:cs="Arial"/>
+          <w:sz w:val="21"/>
+          <w:szCs w:val="21"/>
+        </w:rPr>
+        <w:t xml:space="preserve">Advanced Robotics; </w:t>
+      </w:r>
+      <w:r>
+        <w:rPr>
+          <w:rFonts w:ascii="Garamond" w:hAnsi="Garamond" w:cs="Arial"/>
+          <w:sz w:val="21"/>
+          <w:szCs w:val="21"/>
+        </w:rPr>
+        <w:t>Dynamics and Control</w:t>
+      </w:r>
+      <w:r>
+        <w:rPr>
+          <w:rFonts w:ascii="Garamond" w:hAnsi="Garamond" w:cs="Arial"/>
+          <w:sz w:val="21"/>
+          <w:szCs w:val="21"/>
+        </w:rPr>
+        <w:t>;</w:t>
       </w:r>
       <w:r>
         <w:rPr>
@@ -1215,103 +1354,7 @@
           <w:sz w:val="21"/>
           <w:szCs w:val="21"/>
         </w:rPr>
-        <w:t>F1</w:t>
-      </w:r>
-      <w:r>
-        <w:rPr>
-          <w:rFonts w:ascii="Garamond" w:hAnsi="Garamond" w:cs="Arial"/>
-          <w:sz w:val="21"/>
-          <w:szCs w:val="21"/>
-        </w:rPr>
-        <w:t xml:space="preserve">tenth </w:t>
-      </w:r>
-      <w:r>
-        <w:rPr>
-          <w:rFonts w:ascii="Garamond" w:hAnsi="Garamond" w:cs="Arial"/>
-          <w:sz w:val="21"/>
-          <w:szCs w:val="21"/>
-        </w:rPr>
-        <w:t>Autonomous Racing Cars</w:t>
-      </w:r>
-      <w:r>
-        <w:rPr>
-          <w:rFonts w:ascii="Garamond" w:hAnsi="Garamond" w:cs="Arial"/>
-          <w:sz w:val="21"/>
-          <w:szCs w:val="21"/>
-        </w:rPr>
-        <w:t xml:space="preserve">; </w:t>
-      </w:r>
-      <w:r>
-        <w:rPr>
-          <w:rFonts w:ascii="Garamond" w:hAnsi="Garamond" w:cs="Arial"/>
-          <w:sz w:val="21"/>
-          <w:szCs w:val="21"/>
-        </w:rPr>
-        <w:t xml:space="preserve">Advanced Robotics; </w:t>
-      </w:r>
-      <w:r>
-        <w:rPr>
-          <w:rFonts w:ascii="Garamond" w:hAnsi="Garamond" w:cs="Arial"/>
-          <w:sz w:val="21"/>
-          <w:szCs w:val="21"/>
-        </w:rPr>
-        <w:t>Computer Vision</w:t>
-      </w:r>
-      <w:r>
-        <w:rPr>
-          <w:rFonts w:ascii="Garamond" w:hAnsi="Garamond" w:cs="Arial"/>
-          <w:sz w:val="21"/>
-          <w:szCs w:val="21"/>
-        </w:rPr>
-        <w:t xml:space="preserve">; </w:t>
-      </w:r>
-      <w:r>
-        <w:rPr>
-          <w:rFonts w:ascii="Garamond" w:hAnsi="Garamond" w:cs="Arial"/>
-          <w:sz w:val="21"/>
-          <w:szCs w:val="21"/>
-        </w:rPr>
-        <w:t>Machine Perception</w:t>
-      </w:r>
-      <w:r>
-        <w:rPr>
-          <w:rFonts w:ascii="Garamond" w:hAnsi="Garamond" w:cs="Arial"/>
-          <w:sz w:val="21"/>
-          <w:szCs w:val="21"/>
-        </w:rPr>
-        <w:t xml:space="preserve">; </w:t>
-      </w:r>
-      <w:r>
-        <w:rPr>
-          <w:rFonts w:ascii="Garamond" w:hAnsi="Garamond" w:cs="Arial"/>
-          <w:sz w:val="21"/>
-          <w:szCs w:val="21"/>
-        </w:rPr>
-        <w:t>Dynamics and Control</w:t>
-      </w:r>
-      <w:r>
-        <w:rPr>
-          <w:rFonts w:ascii="Garamond" w:hAnsi="Garamond" w:cs="Arial"/>
-          <w:sz w:val="21"/>
-          <w:szCs w:val="21"/>
-        </w:rPr>
-        <w:t>;</w:t>
-      </w:r>
-      <w:r>
-        <w:rPr>
-          <w:rFonts w:ascii="Garamond" w:hAnsi="Garamond" w:cs="Arial"/>
-          <w:sz w:val="21"/>
-          <w:szCs w:val="21"/>
-        </w:rPr>
-        <w:t xml:space="preserve"> </w:t>
-      </w:r>
-      <w:r>
-        <w:rPr>
-          <w:rFonts w:ascii="Garamond" w:hAnsi="Garamond" w:cs="Arial"/>
-          <w:sz w:val="21"/>
-          <w:szCs w:val="21"/>
-        </w:rPr>
-        <w:t>Machine Learning; Deep Generative Models</w:t>
+        <w:t>Deep Generative Models</w:t>
       </w:r>
     </w:p>
     <w:p>
@@ -4784,15 +4827,6 @@
 </file>
 
 <file path=customXml/item1.xml><?xml version="1.0" encoding="utf-8"?>
-<?mso-contentType ?>
-<FormTemplates xmlns="http://schemas.microsoft.com/sharepoint/v3/contenttype/forms">
-  <Display>DocumentLibraryForm</Display>
-  <Edit>DocumentLibraryForm</Edit>
-  <New>DocumentLibraryForm</New>
-</FormTemplates>
-</file>
-
-<file path=customXml/item2.xml><?xml version="1.0" encoding="utf-8"?>
 <ct:contentTypeSchema xmlns:ct="http://schemas.microsoft.com/office/2006/metadata/contentType" xmlns:ma="http://schemas.microsoft.com/office/2006/metadata/properties/metaAttributes" ct:_="" ma:_="" ma:contentTypeName="Document" ma:contentTypeID="0x010100E00F7205C82CFC49993A09459E403F9D" ma:contentTypeVersion="11" ma:contentTypeDescription="Create a new document." ma:contentTypeScope="" ma:versionID="15ca1506d9d0bc3d30df8ed0110f0d4e">
   <xsd:schema xmlns:xsd="http://www.w3.org/2001/XMLSchema" xmlns:xs="http://www.w3.org/2001/XMLSchema" xmlns:p="http://schemas.microsoft.com/office/2006/metadata/properties" xmlns:ns2="8f1b7c86-42c5-4929-b887-8cfd13270314" xmlns:ns3="671c1944-cc4f-476c-949f-52559c641db4" targetNamespace="http://schemas.microsoft.com/office/2006/metadata/properties" ma:root="true" ma:fieldsID="db6c2aada95e6879eb2870ebec6b4aa1" ns2:_="" ns3:_="">
     <xsd:import namespace="8f1b7c86-42c5-4929-b887-8cfd13270314"/>
@@ -5003,15 +5037,16 @@
 </ct:contentTypeSchema>
 </file>
 
-<file path=customXml/itemProps1.xml><?xml version="1.0" encoding="utf-8"?>
-<ds:datastoreItem xmlns:ds="http://schemas.openxmlformats.org/officeDocument/2006/customXml" ds:itemID="{8E8AFA64-578D-46FF-A288-428D1FA7C9F1}">
-  <ds:schemaRefs>
-    <ds:schemaRef ds:uri="http://schemas.microsoft.com/sharepoint/v3/contenttype/forms"/>
-  </ds:schemaRefs>
-</ds:datastoreItem>
+<file path=customXml/item2.xml><?xml version="1.0" encoding="utf-8"?>
+<?mso-contentType ?>
+<FormTemplates xmlns="http://schemas.microsoft.com/sharepoint/v3/contenttype/forms">
+  <Display>DocumentLibraryForm</Display>
+  <Edit>DocumentLibraryForm</Edit>
+  <New>DocumentLibraryForm</New>
+</FormTemplates>
 </file>
 
-<file path=customXml/itemProps2.xml><?xml version="1.0" encoding="utf-8"?>
+<file path=customXml/itemProps1.xml><?xml version="1.0" encoding="utf-8"?>
 <ds:datastoreItem xmlns:ds="http://schemas.openxmlformats.org/officeDocument/2006/customXml" ds:itemID="{5ECCFF00-82E4-439E-8D62-678F77120EF2}">
   <ds:schemaRefs>
     <ds:schemaRef ds:uri="http://schemas.microsoft.com/office/2006/metadata/contentType"/>
@@ -5028,4 +5063,12 @@
     <ds:schemaRef ds:uri="http://schemas.microsoft.com/internal/obd"/>
   </ds:schemaRefs>
 </ds:datastoreItem>
+</file>
+
+<file path=customXml/itemProps2.xml><?xml version="1.0" encoding="utf-8"?>
+<ds:datastoreItem xmlns:ds="http://schemas.openxmlformats.org/officeDocument/2006/customXml" ds:itemID="{8E8AFA64-578D-46FF-A288-428D1FA7C9F1}">
+  <ds:schemaRefs>
+    <ds:schemaRef ds:uri="http://schemas.microsoft.com/sharepoint/v3/contenttype/forms"/>
+  </ds:schemaRefs>
+</ds:datastoreItem>
 </file>
</xml_diff>

<commit_message>
intrinsic Robotics Software Engineer Intern
</commit_message>
<xml_diff>
--- a/Marika_Nishi_Resume.docx
+++ b/Marika_Nishi_Resume.docx
@@ -12,8 +12,8 @@
         <w:spacing w:after="0" w:line="240" w:lineRule="auto"/>
         <w:rPr>
           <w:rFonts w:ascii="Garamond" w:hAnsi="Garamond" w:cs="Arial"/>
-          <w:sz w:val="32"/>
-          <w:szCs w:val="32"/>
+          <w:sz w:val="28"/>
+          <w:szCs w:val="28"/>
         </w:rPr>
       </w:pPr>
       <w:r>
@@ -43,15 +43,7 @@
           <w:sz w:val="18"/>
           <w:szCs w:val="8"/>
         </w:rPr>
-        <w:t>Robotics Engineering Intern</w:t>
-      </w:r>
-      <w:r>
-        <w:rPr>
-          <w:rFonts w:ascii="Times New Roman" w:hAnsi="Times New Roman" w:cs="Times New Roman"/>
-          <w:sz w:val="18"/>
-          <w:szCs w:val="8"/>
-        </w:rPr>
-        <w:tab/>
+        <w:t>Intern Robotics Software Engineer</w:t>
       </w:r>
     </w:p>
     <w:p>
@@ -342,7 +334,27 @@
           <w:sz w:val="21"/>
           <w:szCs w:val="21"/>
         </w:rPr>
-        <w:t>Major: Robotics</w:t>
+        <w:t>Major</w:t>
+      </w:r>
+      <w:r>
+        <w:rPr>
+          <w:rFonts w:ascii="Garamond" w:hAnsi="Garamond" w:cs="Arial"/>
+          <w:i/>
+          <w:iCs/>
+          <w:sz w:val="21"/>
+          <w:szCs w:val="21"/>
+        </w:rPr>
+        <w:t>s</w:t>
+      </w:r>
+      <w:r>
+        <w:rPr>
+          <w:rFonts w:ascii="Garamond" w:hAnsi="Garamond" w:cs="Arial"/>
+          <w:i/>
+          <w:iCs/>
+          <w:sz w:val="21"/>
+          <w:szCs w:val="21"/>
+        </w:rPr>
+        <w:t>: Robotics</w:t>
       </w:r>
       <w:r>
         <w:rPr>
@@ -370,17 +382,17 @@
           <w:sz w:val="21"/>
           <w:szCs w:val="21"/>
         </w:rPr>
-        <w:t xml:space="preserve">Concentrations: Autonomous </w:t>
-      </w:r>
-      <w:r>
-        <w:rPr>
-          <w:rFonts w:ascii="Garamond" w:hAnsi="Garamond" w:cs="Arial"/>
-          <w:i/>
-          <w:iCs/>
-          <w:sz w:val="21"/>
-          <w:szCs w:val="21"/>
-        </w:rPr>
-        <w:t>Driving</w:t>
+        <w:t xml:space="preserve">Concentration: </w:t>
+      </w:r>
+      <w:r>
+        <w:rPr>
+          <w:rFonts w:ascii="Garamond" w:hAnsi="Garamond" w:cs="Arial"/>
+          <w:i/>
+          <w:iCs/>
+          <w:sz w:val="21"/>
+          <w:szCs w:val="21"/>
+        </w:rPr>
+        <w:t>Computer Vision</w:t>
       </w:r>
       <w:r>
         <w:rPr>
@@ -732,7 +744,25 @@
           <w:sz w:val="21"/>
           <w:szCs w:val="21"/>
         </w:rPr>
-        <w:t>C++</w:t>
+        <w:t xml:space="preserve">AI, Machine Learning, </w:t>
+      </w:r>
+      <w:r>
+        <w:rPr>
+          <w:rFonts w:ascii="Garamond" w:hAnsi="Garamond" w:cs="Arial"/>
+          <w:iCs/>
+          <w:sz w:val="21"/>
+          <w:szCs w:val="21"/>
+        </w:rPr>
+        <w:t>ROS</w:t>
+      </w:r>
+      <w:r>
+        <w:rPr>
+          <w:rFonts w:ascii="Garamond" w:hAnsi="Garamond" w:cs="Arial"/>
+          <w:iCs/>
+          <w:sz w:val="21"/>
+          <w:szCs w:val="21"/>
+        </w:rPr>
+        <w:t xml:space="preserve"> (Robot Operating System)</w:t>
       </w:r>
       <w:r>
         <w:rPr>
@@ -750,94 +780,75 @@
           <w:sz w:val="21"/>
           <w:szCs w:val="21"/>
         </w:rPr>
-        <w:t xml:space="preserve">Python, </w:t>
-      </w:r>
-      <w:r>
-        <w:rPr>
-          <w:rFonts w:ascii="Garamond" w:hAnsi="Garamond" w:cs="Arial"/>
-          <w:iCs/>
-          <w:sz w:val="21"/>
-          <w:szCs w:val="21"/>
-        </w:rPr>
-        <w:t xml:space="preserve">Linux, </w:t>
-      </w:r>
-      <w:r>
-        <w:rPr>
-          <w:rFonts w:ascii="Garamond" w:hAnsi="Garamond" w:cs="Arial"/>
-          <w:iCs/>
-          <w:sz w:val="21"/>
-          <w:szCs w:val="21"/>
-        </w:rPr>
-        <w:t xml:space="preserve">ROS, </w:t>
-      </w:r>
-      <w:r>
-        <w:rPr>
-          <w:rFonts w:ascii="Garamond" w:hAnsi="Garamond" w:cs="Arial"/>
-          <w:iCs/>
-          <w:sz w:val="21"/>
-          <w:szCs w:val="21"/>
-        </w:rPr>
-        <w:t xml:space="preserve">Pytorch, </w:t>
-      </w:r>
-      <w:r>
-        <w:rPr>
-          <w:rFonts w:ascii="Garamond" w:hAnsi="Garamond" w:cs="Arial"/>
-          <w:iCs/>
-          <w:sz w:val="21"/>
-          <w:szCs w:val="21"/>
-        </w:rPr>
-        <w:t>ML-based</w:t>
-      </w:r>
-      <w:r>
-        <w:rPr>
-          <w:rFonts w:ascii="Garamond" w:hAnsi="Garamond" w:cs="Arial"/>
-          <w:iCs/>
-          <w:sz w:val="21"/>
-          <w:szCs w:val="21"/>
-        </w:rPr>
-        <w:t xml:space="preserve"> Planning, </w:t>
-      </w:r>
-      <w:r>
-        <w:rPr>
-          <w:rFonts w:ascii="Garamond" w:hAnsi="Garamond" w:cs="Arial"/>
-          <w:iCs/>
-          <w:sz w:val="21"/>
-          <w:szCs w:val="21"/>
-        </w:rPr>
-        <w:t xml:space="preserve">Machine Learning, </w:t>
-      </w:r>
-      <w:r>
-        <w:rPr>
-          <w:rFonts w:ascii="Garamond" w:hAnsi="Garamond" w:cs="Arial"/>
-          <w:sz w:val="21"/>
-          <w:szCs w:val="21"/>
-        </w:rPr>
-        <w:t>Simulator</w:t>
-      </w:r>
-      <w:r>
-        <w:rPr>
-          <w:rFonts w:ascii="Garamond" w:hAnsi="Garamond" w:cs="Arial"/>
-          <w:sz w:val="21"/>
-          <w:szCs w:val="21"/>
-        </w:rPr>
-        <w:t xml:space="preserve"> (Gazebo, MuJoCo)</w:t>
-      </w:r>
-      <w:r>
-        <w:rPr>
-          <w:rFonts w:ascii="Garamond" w:hAnsi="Garamond" w:cs="Arial"/>
-          <w:sz w:val="21"/>
-          <w:szCs w:val="21"/>
-        </w:rPr>
-        <w:t xml:space="preserve">, </w:t>
-      </w:r>
-      <w:r>
-        <w:rPr>
-          <w:rFonts w:ascii="Garamond" w:hAnsi="Garamond" w:cs="Arial"/>
-          <w:iCs/>
-          <w:sz w:val="21"/>
-          <w:szCs w:val="21"/>
-        </w:rPr>
-        <w:t xml:space="preserve">Control, </w:t>
+        <w:t>Python,</w:t>
+      </w:r>
+      <w:r>
+        <w:rPr>
+          <w:rFonts w:ascii="Garamond" w:hAnsi="Garamond" w:cs="Arial"/>
+          <w:iCs/>
+          <w:sz w:val="21"/>
+          <w:szCs w:val="21"/>
+        </w:rPr>
+        <w:t xml:space="preserve"> </w:t>
+      </w:r>
+      <w:r>
+        <w:rPr>
+          <w:rFonts w:ascii="Garamond" w:hAnsi="Garamond" w:cs="Arial"/>
+          <w:iCs/>
+          <w:sz w:val="21"/>
+          <w:szCs w:val="21"/>
+        </w:rPr>
+        <w:t xml:space="preserve">PyTorch, C++, C, </w:t>
+      </w:r>
+      <w:r>
+        <w:rPr>
+          <w:rFonts w:ascii="Garamond" w:hAnsi="Garamond" w:cs="Arial"/>
+          <w:iCs/>
+          <w:sz w:val="21"/>
+          <w:szCs w:val="21"/>
+        </w:rPr>
+        <w:t xml:space="preserve">data capture, processing, analysis, </w:t>
+      </w:r>
+      <w:r>
+        <w:rPr>
+          <w:rFonts w:ascii="Garamond" w:hAnsi="Garamond" w:cs="Arial"/>
+          <w:sz w:val="21"/>
+          <w:szCs w:val="21"/>
+        </w:rPr>
+        <w:t>Simulation (Gazebo, MuJoCo),</w:t>
+      </w:r>
+      <w:r>
+        <w:rPr>
+          <w:rFonts w:ascii="Garamond" w:hAnsi="Garamond" w:cs="Arial"/>
+          <w:sz w:val="21"/>
+          <w:szCs w:val="21"/>
+        </w:rPr>
+        <w:t xml:space="preserve"> </w:t>
+      </w:r>
+      <w:r>
+        <w:rPr>
+          <w:rFonts w:ascii="Garamond" w:hAnsi="Garamond" w:cs="Arial"/>
+          <w:iCs/>
+          <w:sz w:val="21"/>
+          <w:szCs w:val="21"/>
+        </w:rPr>
+        <w:t>Localization,</w:t>
+      </w:r>
+      <w:r>
+        <w:rPr>
+          <w:rFonts w:ascii="Garamond" w:hAnsi="Garamond" w:cs="Arial"/>
+          <w:sz w:val="21"/>
+          <w:szCs w:val="21"/>
+        </w:rPr>
+        <w:t xml:space="preserve"> </w:t>
+      </w:r>
+      <w:r>
+        <w:rPr>
+          <w:rFonts w:ascii="Garamond" w:hAnsi="Garamond" w:cs="Arial"/>
+          <w:sz w:val="21"/>
+          <w:szCs w:val="21"/>
+        </w:rPr>
+        <w:t xml:space="preserve">SLAM, Image Processing, </w:t>
       </w:r>
       <w:r>
         <w:rPr>
@@ -850,120 +861,19 @@
       <w:r>
         <w:rPr>
           <w:rFonts w:ascii="Garamond" w:hAnsi="Garamond" w:cs="Arial"/>
-          <w:sz w:val="21"/>
-          <w:szCs w:val="21"/>
-        </w:rPr>
-        <w:t xml:space="preserve">SLAM, </w:t>
-      </w:r>
-      <w:r>
-        <w:rPr>
-          <w:rFonts w:ascii="Garamond" w:hAnsi="Garamond" w:cs="Arial"/>
-          <w:sz w:val="21"/>
-          <w:szCs w:val="21"/>
-        </w:rPr>
-        <w:t>S</w:t>
-      </w:r>
-      <w:r>
-        <w:rPr>
-          <w:rFonts w:ascii="Garamond" w:hAnsi="Garamond" w:cs="Arial"/>
-          <w:sz w:val="21"/>
-          <w:szCs w:val="21"/>
-        </w:rPr>
-        <w:t xml:space="preserve">ensor </w:t>
-      </w:r>
-      <w:r>
-        <w:rPr>
-          <w:rFonts w:ascii="Garamond" w:hAnsi="Garamond" w:cs="Arial"/>
-          <w:sz w:val="21"/>
-          <w:szCs w:val="21"/>
-        </w:rPr>
-        <w:t>F</w:t>
-      </w:r>
-      <w:r>
-        <w:rPr>
-          <w:rFonts w:ascii="Garamond" w:hAnsi="Garamond" w:cs="Arial"/>
-          <w:sz w:val="21"/>
-          <w:szCs w:val="21"/>
-        </w:rPr>
-        <w:t xml:space="preserve">usion, </w:t>
-      </w:r>
-      <w:r>
-        <w:rPr>
-          <w:rFonts w:ascii="Garamond" w:hAnsi="Garamond" w:cs="Arial"/>
-          <w:sz w:val="21"/>
-          <w:szCs w:val="21"/>
-        </w:rPr>
-        <w:t xml:space="preserve">Object Detection, </w:t>
-      </w:r>
-      <w:r>
-        <w:rPr>
-          <w:rFonts w:ascii="Garamond" w:hAnsi="Garamond" w:cs="Arial"/>
-          <w:sz w:val="21"/>
-          <w:szCs w:val="21"/>
-        </w:rPr>
-        <w:t>Segmentation,</w:t>
-      </w:r>
-      <w:r>
-        <w:rPr>
-          <w:rFonts w:ascii="Garamond" w:hAnsi="Garamond" w:cs="Arial"/>
-          <w:sz w:val="21"/>
-          <w:szCs w:val="21"/>
-        </w:rPr>
-        <w:t xml:space="preserve"> </w:t>
-      </w:r>
-      <w:r>
-        <w:rPr>
-          <w:rFonts w:ascii="Garamond" w:hAnsi="Garamond" w:cs="Arial"/>
-          <w:iCs/>
-          <w:sz w:val="21"/>
-          <w:szCs w:val="21"/>
-        </w:rPr>
-        <w:t xml:space="preserve">Matlab, </w:t>
-      </w:r>
-      <w:r>
-        <w:rPr>
-          <w:rFonts w:ascii="Garamond" w:hAnsi="Garamond" w:cs="Arial"/>
-          <w:iCs/>
-          <w:sz w:val="21"/>
-          <w:szCs w:val="21"/>
-        </w:rPr>
-        <w:t>Autonomous driving</w:t>
-      </w:r>
-      <w:r>
-        <w:rPr>
-          <w:rFonts w:ascii="Garamond" w:hAnsi="Garamond" w:cs="Arial"/>
-          <w:iCs/>
-          <w:sz w:val="21"/>
-          <w:szCs w:val="21"/>
-        </w:rPr>
-        <w:t xml:space="preserve">, </w:t>
-      </w:r>
-      <w:r>
-        <w:rPr>
-          <w:rFonts w:ascii="Garamond" w:hAnsi="Garamond" w:cs="Arial"/>
-          <w:iCs/>
-          <w:sz w:val="21"/>
-          <w:szCs w:val="21"/>
-        </w:rPr>
-        <w:t>Git,</w:t>
-      </w:r>
-      <w:r>
-        <w:rPr>
-          <w:rFonts w:ascii="Garamond" w:hAnsi="Garamond" w:cs="Arial"/>
-          <w:iCs/>
-          <w:sz w:val="21"/>
-          <w:szCs w:val="21"/>
-        </w:rPr>
-        <w:t xml:space="preserve"> </w:t>
-      </w:r>
-      <w:r>
-        <w:rPr>
-          <w:rFonts w:ascii="Garamond" w:hAnsi="Garamond" w:cs="Arial"/>
-          <w:iCs/>
-          <w:sz w:val="21"/>
-          <w:szCs w:val="21"/>
-        </w:rPr>
-        <w:t>Docker</w:t>
+          <w:iCs/>
+          <w:sz w:val="21"/>
+          <w:szCs w:val="21"/>
+        </w:rPr>
+        <w:t xml:space="preserve">ML-based planning, </w:t>
+      </w:r>
+      <w:r>
+        <w:rPr>
+          <w:rFonts w:ascii="Garamond" w:hAnsi="Garamond" w:cs="Arial"/>
+          <w:sz w:val="21"/>
+          <w:szCs w:val="21"/>
+        </w:rPr>
+        <w:t>Sensor Fusion</w:t>
       </w:r>
     </w:p>
     <w:p>
@@ -986,19 +896,13 @@
           <w:sz w:val="21"/>
           <w:szCs w:val="21"/>
         </w:rPr>
-        <w:t xml:space="preserve">Hardware Skills: </w:t>
-      </w:r>
-      <w:r>
-        <w:rPr>
-          <w:rFonts w:ascii="Garamond" w:hAnsi="Garamond" w:cs="Arial"/>
-          <w:sz w:val="21"/>
-          <w:szCs w:val="21"/>
-        </w:rPr>
-        <w:t>CAD,</w:t>
-      </w:r>
-      <w:r>
-        <w:rPr>
-          <w:rFonts w:ascii="Garamond" w:hAnsi="Garamond" w:cs="Arial"/>
+        <w:t>Hardware Skills:</w:t>
+      </w:r>
+      <w:r>
+        <w:rPr>
+          <w:rFonts w:ascii="Garamond" w:hAnsi="Garamond" w:cs="Arial"/>
+          <w:b/>
+          <w:bCs/>
           <w:sz w:val="21"/>
           <w:szCs w:val="21"/>
         </w:rPr>
@@ -1010,39 +914,127 @@
           <w:sz w:val="21"/>
           <w:szCs w:val="21"/>
         </w:rPr>
-        <w:t>m</w:t>
-      </w:r>
-      <w:r>
-        <w:rPr>
-          <w:rFonts w:ascii="Garamond" w:hAnsi="Garamond" w:cs="Arial"/>
-          <w:sz w:val="21"/>
-          <w:szCs w:val="21"/>
-        </w:rPr>
-        <w:t xml:space="preserve">echanical </w:t>
-      </w:r>
-      <w:r>
-        <w:rPr>
-          <w:rFonts w:ascii="Garamond" w:hAnsi="Garamond" w:cs="Arial"/>
-          <w:sz w:val="21"/>
-          <w:szCs w:val="21"/>
-        </w:rPr>
-        <w:t>d</w:t>
-      </w:r>
-      <w:r>
-        <w:rPr>
-          <w:rFonts w:ascii="Garamond" w:hAnsi="Garamond" w:cs="Arial"/>
-          <w:sz w:val="21"/>
-          <w:szCs w:val="21"/>
-        </w:rPr>
-        <w:t xml:space="preserve">esign, </w:t>
-      </w:r>
-      <w:r>
-        <w:rPr>
-          <w:rFonts w:ascii="Garamond" w:hAnsi="Garamond" w:cs="Arial"/>
-          <w:sz w:val="21"/>
-          <w:szCs w:val="21"/>
-        </w:rPr>
-        <w:t xml:space="preserve">test and measurement, </w:t>
+        <w:t xml:space="preserve">End-to-end, </w:t>
+      </w:r>
+      <w:r>
+        <w:rPr>
+          <w:rFonts w:ascii="Garamond" w:hAnsi="Garamond" w:cs="Arial"/>
+          <w:sz w:val="21"/>
+          <w:szCs w:val="21"/>
+        </w:rPr>
+        <w:t>Hardware-in-</w:t>
+      </w:r>
+      <w:r>
+        <w:rPr>
+          <w:rFonts w:ascii="Garamond" w:hAnsi="Garamond" w:cs="Arial"/>
+          <w:sz w:val="21"/>
+          <w:szCs w:val="21"/>
+        </w:rPr>
+        <w:t>the</w:t>
+      </w:r>
+      <w:r>
+        <w:rPr>
+          <w:rFonts w:ascii="Garamond" w:hAnsi="Garamond" w:cs="Arial"/>
+          <w:sz w:val="21"/>
+          <w:szCs w:val="21"/>
+        </w:rPr>
+        <w:t>-</w:t>
+      </w:r>
+      <w:r>
+        <w:rPr>
+          <w:rFonts w:ascii="Garamond" w:hAnsi="Garamond" w:cs="Arial"/>
+          <w:sz w:val="21"/>
+          <w:szCs w:val="21"/>
+        </w:rPr>
+        <w:t>L</w:t>
+      </w:r>
+      <w:r>
+        <w:rPr>
+          <w:rFonts w:ascii="Garamond" w:hAnsi="Garamond" w:cs="Arial"/>
+          <w:sz w:val="21"/>
+          <w:szCs w:val="21"/>
+        </w:rPr>
+        <w:t>oop,</w:t>
+      </w:r>
+      <w:r>
+        <w:rPr>
+          <w:rFonts w:ascii="Garamond" w:hAnsi="Garamond" w:cs="Arial"/>
+          <w:sz w:val="21"/>
+          <w:szCs w:val="21"/>
+        </w:rPr>
+        <w:t xml:space="preserve"> </w:t>
+      </w:r>
+      <w:r>
+        <w:rPr>
+          <w:rFonts w:ascii="Garamond" w:hAnsi="Garamond" w:cs="Arial"/>
+          <w:sz w:val="21"/>
+          <w:szCs w:val="21"/>
+        </w:rPr>
+        <w:t xml:space="preserve">Arduino, </w:t>
+      </w:r>
+      <w:r>
+        <w:rPr>
+          <w:rFonts w:ascii="Garamond" w:hAnsi="Garamond" w:cs="Arial"/>
+          <w:sz w:val="21"/>
+          <w:szCs w:val="21"/>
+        </w:rPr>
+        <w:t>S</w:t>
+      </w:r>
+      <w:r>
+        <w:rPr>
+          <w:rFonts w:ascii="Garamond" w:hAnsi="Garamond" w:cs="Arial"/>
+          <w:sz w:val="21"/>
+          <w:szCs w:val="21"/>
+        </w:rPr>
+        <w:t>oldering,</w:t>
+      </w:r>
+      <w:r>
+        <w:rPr>
+          <w:rFonts w:ascii="Garamond" w:hAnsi="Garamond" w:cs="Arial"/>
+          <w:sz w:val="21"/>
+          <w:szCs w:val="21"/>
+        </w:rPr>
+        <w:t xml:space="preserve"> CAD</w:t>
+      </w:r>
+      <w:r>
+        <w:rPr>
+          <w:rFonts w:ascii="Garamond" w:hAnsi="Garamond" w:cs="Arial"/>
+          <w:sz w:val="21"/>
+          <w:szCs w:val="21"/>
+        </w:rPr>
+        <w:t>,</w:t>
+      </w:r>
+      <w:r>
+        <w:rPr>
+          <w:rFonts w:ascii="Garamond" w:hAnsi="Garamond" w:cs="Arial"/>
+          <w:sz w:val="21"/>
+          <w:szCs w:val="21"/>
+        </w:rPr>
+        <w:t xml:space="preserve"> </w:t>
+      </w:r>
+      <w:r>
+        <w:rPr>
+          <w:rFonts w:ascii="Garamond" w:hAnsi="Garamond" w:cs="Arial"/>
+          <w:sz w:val="21"/>
+          <w:szCs w:val="21"/>
+        </w:rPr>
+        <w:t xml:space="preserve">3D </w:t>
+      </w:r>
+      <w:r>
+        <w:rPr>
+          <w:rFonts w:ascii="Garamond" w:hAnsi="Garamond" w:cs="Arial"/>
+          <w:sz w:val="21"/>
+          <w:szCs w:val="21"/>
+        </w:rPr>
+        <w:t>print</w:t>
+      </w:r>
+      <w:r>
+        <w:rPr>
+          <w:rFonts w:ascii="Garamond" w:hAnsi="Garamond" w:cs="Arial"/>
+          <w:sz w:val="21"/>
+          <w:szCs w:val="21"/>
+        </w:rPr>
+        <w:t xml:space="preserve">, </w:t>
       </w:r>
       <w:r>
         <w:rPr>
@@ -1090,15 +1082,7 @@
           <w:sz w:val="21"/>
           <w:szCs w:val="21"/>
         </w:rPr>
-        <w:t xml:space="preserve">IMU, </w:t>
-      </w:r>
-      <w:r>
-        <w:rPr>
-          <w:rFonts w:ascii="Garamond" w:hAnsi="Garamond" w:cs="Arial"/>
-          <w:sz w:val="21"/>
-          <w:szCs w:val="21"/>
-        </w:rPr>
-        <w:t>Additive Manufacturing</w:t>
+        <w:t>IMU</w:t>
       </w:r>
     </w:p>
     <w:p>
@@ -1130,6 +1114,46 @@
           <w:sz w:val="21"/>
           <w:szCs w:val="21"/>
         </w:rPr>
+        <w:t xml:space="preserve">Problem solving skills, Analytical skills, </w:t>
+      </w:r>
+      <w:r>
+        <w:rPr>
+          <w:rFonts w:ascii="Garamond" w:hAnsi="Garamond" w:cs="Arial"/>
+          <w:sz w:val="21"/>
+          <w:szCs w:val="21"/>
+        </w:rPr>
+        <w:t xml:space="preserve">Collaboration, </w:t>
+      </w:r>
+      <w:r>
+        <w:rPr>
+          <w:rFonts w:ascii="Garamond" w:hAnsi="Garamond" w:cs="Arial"/>
+          <w:sz w:val="21"/>
+          <w:szCs w:val="21"/>
+        </w:rPr>
+        <w:t>Communication,</w:t>
+      </w:r>
+      <w:r>
+        <w:rPr>
+          <w:rFonts w:ascii="Garamond" w:hAnsi="Garamond" w:cs="Arial"/>
+          <w:sz w:val="21"/>
+          <w:szCs w:val="21"/>
+        </w:rPr>
+        <w:t xml:space="preserve"> </w:t>
+      </w:r>
+      <w:r>
+        <w:rPr>
+          <w:rFonts w:ascii="Garamond" w:hAnsi="Garamond" w:cs="Arial"/>
+          <w:sz w:val="21"/>
+          <w:szCs w:val="21"/>
+        </w:rPr>
+        <w:t xml:space="preserve">Teamwork, </w:t>
+      </w:r>
+      <w:r>
+        <w:rPr>
+          <w:rFonts w:ascii="Garamond" w:hAnsi="Garamond" w:cs="Arial"/>
+          <w:sz w:val="21"/>
+          <w:szCs w:val="21"/>
+        </w:rPr>
         <w:t xml:space="preserve">Leadership, </w:t>
       </w:r>
       <w:r>
@@ -1138,79 +1162,15 @@
           <w:sz w:val="21"/>
           <w:szCs w:val="21"/>
         </w:rPr>
-        <w:t>Research, Design</w:t>
-      </w:r>
-      <w:r>
-        <w:rPr>
-          <w:rFonts w:ascii="Garamond" w:hAnsi="Garamond" w:cs="Arial"/>
-          <w:sz w:val="21"/>
-          <w:szCs w:val="21"/>
-        </w:rPr>
-        <w:t xml:space="preserve"> and </w:t>
-      </w:r>
-      <w:r>
-        <w:rPr>
-          <w:rFonts w:ascii="Garamond" w:hAnsi="Garamond" w:cs="Arial"/>
-          <w:sz w:val="21"/>
-          <w:szCs w:val="21"/>
-        </w:rPr>
-        <w:t>d</w:t>
-      </w:r>
-      <w:r>
-        <w:rPr>
-          <w:rFonts w:ascii="Garamond" w:hAnsi="Garamond" w:cs="Arial"/>
-          <w:sz w:val="21"/>
-          <w:szCs w:val="21"/>
-        </w:rPr>
-        <w:t>evelopment,</w:t>
-      </w:r>
-      <w:r>
-        <w:rPr>
-          <w:rFonts w:ascii="Garamond" w:hAnsi="Garamond" w:cs="Arial"/>
-          <w:sz w:val="21"/>
-          <w:szCs w:val="21"/>
-        </w:rPr>
-        <w:t xml:space="preserve"> </w:t>
-      </w:r>
-      <w:r>
-        <w:rPr>
-          <w:rFonts w:ascii="Garamond" w:hAnsi="Garamond" w:cs="Arial"/>
-          <w:sz w:val="21"/>
-          <w:szCs w:val="21"/>
-        </w:rPr>
-        <w:t>Report writing</w:t>
-      </w:r>
-      <w:r>
-        <w:rPr>
-          <w:rFonts w:ascii="Garamond" w:hAnsi="Garamond" w:cs="Arial"/>
-          <w:sz w:val="21"/>
-          <w:szCs w:val="21"/>
-        </w:rPr>
-        <w:t xml:space="preserve">, </w:t>
-      </w:r>
-      <w:r>
-        <w:rPr>
-          <w:rFonts w:ascii="Garamond" w:hAnsi="Garamond" w:cs="Arial"/>
-          <w:sz w:val="21"/>
-          <w:szCs w:val="21"/>
-        </w:rPr>
-        <w:t>Teamwork</w:t>
-      </w:r>
-      <w:r>
-        <w:rPr>
-          <w:rFonts w:ascii="Garamond" w:hAnsi="Garamond" w:cs="Arial"/>
-          <w:sz w:val="21"/>
-          <w:szCs w:val="21"/>
-        </w:rPr>
-        <w:t xml:space="preserve">, </w:t>
-      </w:r>
-      <w:r>
-        <w:rPr>
-          <w:rFonts w:ascii="Garamond" w:hAnsi="Garamond" w:cs="Arial"/>
-          <w:sz w:val="21"/>
-          <w:szCs w:val="21"/>
-        </w:rPr>
-        <w:t>Troubleshooting</w:t>
+        <w:t>Research</w:t>
+      </w:r>
+      <w:r>
+        <w:rPr>
+          <w:rFonts w:ascii="Garamond" w:hAnsi="Garamond" w:cs="Arial"/>
+          <w:sz w:val="21"/>
+          <w:szCs w:val="21"/>
+        </w:rPr>
+        <w:t>, EKF</w:t>
       </w:r>
     </w:p>
     <w:p>
@@ -1250,31 +1210,15 @@
           <w:sz w:val="21"/>
           <w:szCs w:val="21"/>
         </w:rPr>
-        <w:t xml:space="preserve">Mechatronics; Automotive Engineering; </w:t>
-      </w:r>
-      <w:r>
-        <w:rPr>
-          <w:rFonts w:ascii="Garamond" w:hAnsi="Garamond" w:cs="Arial"/>
-          <w:sz w:val="21"/>
-          <w:szCs w:val="21"/>
-        </w:rPr>
-        <w:t>F1</w:t>
-      </w:r>
-      <w:r>
-        <w:rPr>
-          <w:rFonts w:ascii="Garamond" w:hAnsi="Garamond" w:cs="Arial"/>
-          <w:sz w:val="21"/>
-          <w:szCs w:val="21"/>
-        </w:rPr>
-        <w:t xml:space="preserve">tenth </w:t>
-      </w:r>
-      <w:r>
-        <w:rPr>
-          <w:rFonts w:ascii="Garamond" w:hAnsi="Garamond" w:cs="Arial"/>
-          <w:sz w:val="21"/>
-          <w:szCs w:val="21"/>
-        </w:rPr>
-        <w:t>Autonomous Racing Cars</w:t>
+        <w:t xml:space="preserve">Deep </w:t>
+      </w:r>
+      <w:r>
+        <w:rPr>
+          <w:rFonts w:ascii="Garamond" w:hAnsi="Garamond" w:cs="Arial"/>
+          <w:sz w:val="21"/>
+          <w:szCs w:val="21"/>
+        </w:rPr>
+        <w:t>Neural Networks</w:t>
       </w:r>
       <w:r>
         <w:rPr>
@@ -1290,6 +1234,62 @@
           <w:sz w:val="21"/>
           <w:szCs w:val="21"/>
         </w:rPr>
+        <w:t xml:space="preserve">Deep Learning; </w:t>
+      </w:r>
+      <w:r>
+        <w:rPr>
+          <w:rFonts w:ascii="Garamond" w:hAnsi="Garamond" w:cs="Arial"/>
+          <w:sz w:val="21"/>
+          <w:szCs w:val="21"/>
+        </w:rPr>
+        <w:t>Computer Vision</w:t>
+      </w:r>
+      <w:r>
+        <w:rPr>
+          <w:rFonts w:ascii="Garamond" w:hAnsi="Garamond" w:cs="Arial"/>
+          <w:sz w:val="21"/>
+          <w:szCs w:val="21"/>
+        </w:rPr>
+        <w:t xml:space="preserve">; </w:t>
+      </w:r>
+      <w:r>
+        <w:rPr>
+          <w:rFonts w:ascii="Garamond" w:hAnsi="Garamond" w:cs="Arial"/>
+          <w:sz w:val="21"/>
+          <w:szCs w:val="21"/>
+        </w:rPr>
+        <w:t xml:space="preserve">F1tenth Autonomous Racing Cars; </w:t>
+      </w:r>
+      <w:r>
+        <w:rPr>
+          <w:rFonts w:ascii="Garamond" w:hAnsi="Garamond" w:cs="Arial"/>
+          <w:sz w:val="21"/>
+          <w:szCs w:val="21"/>
+        </w:rPr>
+        <w:t xml:space="preserve">Automotive Engineering; </w:t>
+      </w:r>
+      <w:r>
+        <w:rPr>
+          <w:rFonts w:ascii="Garamond" w:hAnsi="Garamond" w:cs="Arial"/>
+          <w:sz w:val="21"/>
+          <w:szCs w:val="21"/>
+        </w:rPr>
+        <w:t>Dynamics and Control;</w:t>
+      </w:r>
+      <w:r>
+        <w:rPr>
+          <w:rFonts w:ascii="Garamond" w:hAnsi="Garamond" w:cs="Arial"/>
+          <w:sz w:val="21"/>
+          <w:szCs w:val="21"/>
+        </w:rPr>
+        <w:t xml:space="preserve"> </w:t>
+      </w:r>
+      <w:r>
+        <w:rPr>
+          <w:rFonts w:ascii="Garamond" w:hAnsi="Garamond" w:cs="Arial"/>
+          <w:sz w:val="21"/>
+          <w:szCs w:val="21"/>
+        </w:rPr>
         <w:t>Machine Perception</w:t>
       </w:r>
       <w:r>
@@ -1298,22 +1298,6 @@
           <w:sz w:val="21"/>
           <w:szCs w:val="21"/>
         </w:rPr>
-        <w:t xml:space="preserve">; </w:t>
-      </w:r>
-      <w:r>
-        <w:rPr>
-          <w:rFonts w:ascii="Garamond" w:hAnsi="Garamond" w:cs="Arial"/>
-          <w:sz w:val="21"/>
-          <w:szCs w:val="21"/>
-        </w:rPr>
-        <w:t>Computer Vision</w:t>
-      </w:r>
-      <w:r>
-        <w:rPr>
-          <w:rFonts w:ascii="Garamond" w:hAnsi="Garamond" w:cs="Arial"/>
-          <w:sz w:val="21"/>
-          <w:szCs w:val="21"/>
-        </w:rPr>
         <w:t xml:space="preserve">; Machine Learning; </w:t>
       </w:r>
       <w:r>
@@ -1322,39 +1306,7 @@
           <w:sz w:val="21"/>
           <w:szCs w:val="21"/>
         </w:rPr>
-        <w:t xml:space="preserve">Advanced Robotics; </w:t>
-      </w:r>
-      <w:r>
-        <w:rPr>
-          <w:rFonts w:ascii="Garamond" w:hAnsi="Garamond" w:cs="Arial"/>
-          <w:sz w:val="21"/>
-          <w:szCs w:val="21"/>
-        </w:rPr>
-        <w:t>Dynamics and Control</w:t>
-      </w:r>
-      <w:r>
-        <w:rPr>
-          <w:rFonts w:ascii="Garamond" w:hAnsi="Garamond" w:cs="Arial"/>
-          <w:sz w:val="21"/>
-          <w:szCs w:val="21"/>
-        </w:rPr>
-        <w:t>;</w:t>
-      </w:r>
-      <w:r>
-        <w:rPr>
-          <w:rFonts w:ascii="Garamond" w:hAnsi="Garamond" w:cs="Arial"/>
-          <w:sz w:val="21"/>
-          <w:szCs w:val="21"/>
-        </w:rPr>
-        <w:t xml:space="preserve"> </w:t>
-      </w:r>
-      <w:r>
-        <w:rPr>
-          <w:rFonts w:ascii="Garamond" w:hAnsi="Garamond" w:cs="Arial"/>
-          <w:sz w:val="21"/>
-          <w:szCs w:val="21"/>
-        </w:rPr>
-        <w:t>Deep Generative Models</w:t>
+        <w:t>Mechatronics</w:t>
       </w:r>
     </w:p>
     <w:p>
@@ -4827,6 +4779,15 @@
 </file>
 
 <file path=customXml/item1.xml><?xml version="1.0" encoding="utf-8"?>
+<?mso-contentType ?>
+<FormTemplates xmlns="http://schemas.microsoft.com/sharepoint/v3/contenttype/forms">
+  <Display>DocumentLibraryForm</Display>
+  <Edit>DocumentLibraryForm</Edit>
+  <New>DocumentLibraryForm</New>
+</FormTemplates>
+</file>
+
+<file path=customXml/item2.xml><?xml version="1.0" encoding="utf-8"?>
 <ct:contentTypeSchema xmlns:ct="http://schemas.microsoft.com/office/2006/metadata/contentType" xmlns:ma="http://schemas.microsoft.com/office/2006/metadata/properties/metaAttributes" ct:_="" ma:_="" ma:contentTypeName="Document" ma:contentTypeID="0x010100E00F7205C82CFC49993A09459E403F9D" ma:contentTypeVersion="11" ma:contentTypeDescription="Create a new document." ma:contentTypeScope="" ma:versionID="15ca1506d9d0bc3d30df8ed0110f0d4e">
   <xsd:schema xmlns:xsd="http://www.w3.org/2001/XMLSchema" xmlns:xs="http://www.w3.org/2001/XMLSchema" xmlns:p="http://schemas.microsoft.com/office/2006/metadata/properties" xmlns:ns2="8f1b7c86-42c5-4929-b887-8cfd13270314" xmlns:ns3="671c1944-cc4f-476c-949f-52559c641db4" targetNamespace="http://schemas.microsoft.com/office/2006/metadata/properties" ma:root="true" ma:fieldsID="db6c2aada95e6879eb2870ebec6b4aa1" ns2:_="" ns3:_="">
     <xsd:import namespace="8f1b7c86-42c5-4929-b887-8cfd13270314"/>
@@ -5037,16 +4998,15 @@
 </ct:contentTypeSchema>
 </file>
 
-<file path=customXml/item2.xml><?xml version="1.0" encoding="utf-8"?>
-<?mso-contentType ?>
-<FormTemplates xmlns="http://schemas.microsoft.com/sharepoint/v3/contenttype/forms">
-  <Display>DocumentLibraryForm</Display>
-  <Edit>DocumentLibraryForm</Edit>
-  <New>DocumentLibraryForm</New>
-</FormTemplates>
+<file path=customXml/itemProps1.xml><?xml version="1.0" encoding="utf-8"?>
+<ds:datastoreItem xmlns:ds="http://schemas.openxmlformats.org/officeDocument/2006/customXml" ds:itemID="{8E8AFA64-578D-46FF-A288-428D1FA7C9F1}">
+  <ds:schemaRefs>
+    <ds:schemaRef ds:uri="http://schemas.microsoft.com/sharepoint/v3/contenttype/forms"/>
+  </ds:schemaRefs>
+</ds:datastoreItem>
 </file>
 
-<file path=customXml/itemProps1.xml><?xml version="1.0" encoding="utf-8"?>
+<file path=customXml/itemProps2.xml><?xml version="1.0" encoding="utf-8"?>
 <ds:datastoreItem xmlns:ds="http://schemas.openxmlformats.org/officeDocument/2006/customXml" ds:itemID="{5ECCFF00-82E4-439E-8D62-678F77120EF2}">
   <ds:schemaRefs>
     <ds:schemaRef ds:uri="http://schemas.microsoft.com/office/2006/metadata/contentType"/>
@@ -5063,12 +5023,4 @@
     <ds:schemaRef ds:uri="http://schemas.microsoft.com/internal/obd"/>
   </ds:schemaRefs>
 </ds:datastoreItem>
-</file>
-
-<file path=customXml/itemProps2.xml><?xml version="1.0" encoding="utf-8"?>
-<ds:datastoreItem xmlns:ds="http://schemas.openxmlformats.org/officeDocument/2006/customXml" ds:itemID="{8E8AFA64-578D-46FF-A288-428D1FA7C9F1}">
-  <ds:schemaRefs>
-    <ds:schemaRef ds:uri="http://schemas.microsoft.com/sharepoint/v3/contenttype/forms"/>
-  </ds:schemaRefs>
-</ds:datastoreItem>
 </file>
</xml_diff>

<commit_message>
changed end date of isuzu
</commit_message>
<xml_diff>
--- a/Marika_Nishi_Resume.docx
+++ b/Marika_Nishi_Resume.docx
@@ -859,15 +859,7 @@
           <w:sz w:val="21"/>
           <w:szCs w:val="21"/>
         </w:rPr>
-        <w:t xml:space="preserve"> </w:t>
-      </w:r>
-      <w:r>
-        <w:rPr>
-          <w:rFonts w:ascii="Garamond" w:hAnsi="Garamond" w:cs="Arial"/>
-          <w:sz w:val="21"/>
-          <w:szCs w:val="21"/>
-        </w:rPr>
-        <w:t xml:space="preserve">AI, </w:t>
+        <w:t xml:space="preserve"> AI, </w:t>
       </w:r>
       <w:r>
         <w:rPr>
@@ -1456,7 +1448,7 @@
           <w:sz w:val="21"/>
           <w:szCs w:val="21"/>
         </w:rPr>
-        <w:t>Present</w:t>
+        <w:t>August 2026</w:t>
       </w:r>
     </w:p>
     <w:p>
@@ -3953,15 +3945,6 @@
 </file>
 
 <file path=customXml/item1.xml><?xml version="1.0" encoding="utf-8"?>
-<?mso-contentType ?>
-<FormTemplates xmlns="http://schemas.microsoft.com/sharepoint/v3/contenttype/forms">
-  <Display>DocumentLibraryForm</Display>
-  <Edit>DocumentLibraryForm</Edit>
-  <New>DocumentLibraryForm</New>
-</FormTemplates>
-</file>
-
-<file path=customXml/item2.xml><?xml version="1.0" encoding="utf-8"?>
 <ct:contentTypeSchema xmlns:ct="http://schemas.microsoft.com/office/2006/metadata/contentType" xmlns:ma="http://schemas.microsoft.com/office/2006/metadata/properties/metaAttributes" ct:_="" ma:_="" ma:contentTypeName="Document" ma:contentTypeID="0x010100E00F7205C82CFC49993A09459E403F9D" ma:contentTypeVersion="11" ma:contentTypeDescription="Create a new document." ma:contentTypeScope="" ma:versionID="15ca1506d9d0bc3d30df8ed0110f0d4e">
   <xsd:schema xmlns:xsd="http://www.w3.org/2001/XMLSchema" xmlns:xs="http://www.w3.org/2001/XMLSchema" xmlns:p="http://schemas.microsoft.com/office/2006/metadata/properties" xmlns:ns2="8f1b7c86-42c5-4929-b887-8cfd13270314" xmlns:ns3="671c1944-cc4f-476c-949f-52559c641db4" targetNamespace="http://schemas.microsoft.com/office/2006/metadata/properties" ma:root="true" ma:fieldsID="db6c2aada95e6879eb2870ebec6b4aa1" ns2:_="" ns3:_="">
     <xsd:import namespace="8f1b7c86-42c5-4929-b887-8cfd13270314"/>
@@ -4172,15 +4155,16 @@
 </ct:contentTypeSchema>
 </file>
 
-<file path=customXml/itemProps1.xml><?xml version="1.0" encoding="utf-8"?>
-<ds:datastoreItem xmlns:ds="http://schemas.openxmlformats.org/officeDocument/2006/customXml" ds:itemID="{8E8AFA64-578D-46FF-A288-428D1FA7C9F1}">
-  <ds:schemaRefs>
-    <ds:schemaRef ds:uri="http://schemas.microsoft.com/sharepoint/v3/contenttype/forms"/>
-  </ds:schemaRefs>
-</ds:datastoreItem>
+<file path=customXml/item2.xml><?xml version="1.0" encoding="utf-8"?>
+<?mso-contentType ?>
+<FormTemplates xmlns="http://schemas.microsoft.com/sharepoint/v3/contenttype/forms">
+  <Display>DocumentLibraryForm</Display>
+  <Edit>DocumentLibraryForm</Edit>
+  <New>DocumentLibraryForm</New>
+</FormTemplates>
 </file>
 
-<file path=customXml/itemProps2.xml><?xml version="1.0" encoding="utf-8"?>
+<file path=customXml/itemProps1.xml><?xml version="1.0" encoding="utf-8"?>
 <ds:datastoreItem xmlns:ds="http://schemas.openxmlformats.org/officeDocument/2006/customXml" ds:itemID="{5ECCFF00-82E4-439E-8D62-678F77120EF2}">
   <ds:schemaRefs>
     <ds:schemaRef ds:uri="http://schemas.microsoft.com/office/2006/metadata/contentType"/>
@@ -4197,4 +4181,12 @@
     <ds:schemaRef ds:uri="http://schemas.microsoft.com/internal/obd"/>
   </ds:schemaRefs>
 </ds:datastoreItem>
+</file>
+
+<file path=customXml/itemProps2.xml><?xml version="1.0" encoding="utf-8"?>
+<ds:datastoreItem xmlns:ds="http://schemas.openxmlformats.org/officeDocument/2006/customXml" ds:itemID="{8E8AFA64-578D-46FF-A288-428D1FA7C9F1}">
+  <ds:schemaRefs>
+    <ds:schemaRef ds:uri="http://schemas.microsoft.com/sharepoint/v3/contenttype/forms"/>
+  </ds:schemaRefs>
+</ds:datastoreItem>
 </file>
</xml_diff>